<commit_message>
Performing Data Collection via SpaceX API in Data Science Specialization's Final Project
</commit_message>
<xml_diff>
--- a/10_Applied_Data_Science_Project/2_Project_Notes_Materials/1_Data_Science_Capstone_Project_Notes.docx
+++ b/10_Applied_Data_Science_Project/2_Project_Notes_Materials/1_Data_Science_Capstone_Project_Notes.docx
@@ -472,6 +472,9 @@
         <w:pStyle w:val="NormalWeb"/>
       </w:pPr>
       <w:r>
+        <w:rPr>
+          <w:noProof/>
+        </w:rPr>
         <w:drawing>
           <wp:inline distT="0" distB="0" distL="0" distR="0" wp14:anchorId="6779DF9C" wp14:editId="791A07C9">
             <wp:extent cx="5731510" cy="3031490"/>
@@ -807,6 +810,1126 @@
     </w:p>
     <w:p>
       <w:pPr>
+        <w:pStyle w:val="Heading1"/>
+      </w:pPr>
+      <w:r>
+        <w:lastRenderedPageBreak/>
+        <w:t>Collecting the Data with an API</w:t>
+      </w:r>
+    </w:p>
+    <w:p>
+      <w:pPr>
+        <w:pStyle w:val="Heading2"/>
+      </w:pPr>
+      <w:r>
+        <w:t>Introduction</w:t>
+      </w:r>
+    </w:p>
+    <w:p>
+      <w:pPr>
+        <w:pStyle w:val="NormalWeb"/>
+      </w:pPr>
+      <w:r>
+        <w:t xml:space="preserve">In this capstone assignment, we work with SpaceX launch data gathered from an API, specifically the </w:t>
+      </w:r>
+      <w:r>
+        <w:rPr>
+          <w:rStyle w:val="Strong"/>
+        </w:rPr>
+        <w:t>SpaceX REST API</w:t>
+      </w:r>
+      <w:r>
+        <w:t>. This API provides information about:</w:t>
+      </w:r>
+    </w:p>
+    <w:p>
+      <w:pPr>
+        <w:pStyle w:val="NormalWeb"/>
+        <w:numPr>
+          <w:ilvl w:val="0"/>
+          <w:numId w:val="36"/>
+        </w:numPr>
+      </w:pPr>
+      <w:r>
+        <w:t>The rocket used</w:t>
+      </w:r>
+    </w:p>
+    <w:p>
+      <w:pPr>
+        <w:pStyle w:val="NormalWeb"/>
+        <w:numPr>
+          <w:ilvl w:val="0"/>
+          <w:numId w:val="36"/>
+        </w:numPr>
+      </w:pPr>
+      <w:r>
+        <w:t>Payload delivered</w:t>
+      </w:r>
+    </w:p>
+    <w:p>
+      <w:pPr>
+        <w:pStyle w:val="NormalWeb"/>
+        <w:numPr>
+          <w:ilvl w:val="0"/>
+          <w:numId w:val="36"/>
+        </w:numPr>
+      </w:pPr>
+      <w:r>
+        <w:t>Launch specifications</w:t>
+      </w:r>
+    </w:p>
+    <w:p>
+      <w:pPr>
+        <w:pStyle w:val="NormalWeb"/>
+        <w:numPr>
+          <w:ilvl w:val="0"/>
+          <w:numId w:val="36"/>
+        </w:numPr>
+      </w:pPr>
+      <w:r>
+        <w:t>Landing specifications</w:t>
+      </w:r>
+    </w:p>
+    <w:p>
+      <w:pPr>
+        <w:pStyle w:val="NormalWeb"/>
+        <w:numPr>
+          <w:ilvl w:val="0"/>
+          <w:numId w:val="36"/>
+        </w:numPr>
+      </w:pPr>
+      <w:r>
+        <w:t>Landing outcomes</w:t>
+      </w:r>
+    </w:p>
+    <w:p>
+      <w:pPr>
+        <w:pStyle w:val="NormalWeb"/>
+      </w:pPr>
+      <w:r>
+        <w:t xml:space="preserve">The primary goal is to use this data to </w:t>
+      </w:r>
+      <w:r>
+        <w:rPr>
+          <w:rStyle w:val="Strong"/>
+        </w:rPr>
+        <w:t>predict whether SpaceX will attempt to land a rocket or not</w:t>
+      </w:r>
+      <w:r>
+        <w:t>.</w:t>
+      </w:r>
+    </w:p>
+    <w:p>
+      <w:pPr>
+        <w:pStyle w:val="Heading2"/>
+      </w:pPr>
+      <w:r>
+        <w:t>SpaceX REST API</w:t>
+      </w:r>
+    </w:p>
+    <w:p>
+      <w:pPr>
+        <w:pStyle w:val="NormalWeb"/>
+      </w:pPr>
+      <w:r>
+        <w:t>The SpaceX REST API base URL is:</w:t>
+      </w:r>
+    </w:p>
+    <w:p>
+      <w:pPr>
+        <w:pStyle w:val="HTMLPreformatted"/>
+        <w:rPr>
+          <w:rStyle w:val="HTMLCode"/>
+        </w:rPr>
+      </w:pPr>
+      <w:r>
+        <w:rPr>
+          <w:rStyle w:val="HTMLCode"/>
+        </w:rPr>
+        <w:t>api.spacexdata.com/v4/</w:t>
+      </w:r>
+    </w:p>
+    <w:p>
+      <w:pPr>
+        <w:pStyle w:val="NormalWeb"/>
+      </w:pPr>
+      <w:r>
+        <w:t>Some example endpoints are:</w:t>
+      </w:r>
+    </w:p>
+    <w:p>
+      <w:pPr>
+        <w:pStyle w:val="HTMLPreformatted"/>
+        <w:rPr>
+          <w:rStyle w:val="HTMLCode"/>
+        </w:rPr>
+      </w:pPr>
+      <w:r>
+        <w:rPr>
+          <w:rStyle w:val="HTMLCode"/>
+        </w:rPr>
+        <w:t>/capsules</w:t>
+      </w:r>
+    </w:p>
+    <w:p>
+      <w:pPr>
+        <w:pStyle w:val="HTMLPreformatted"/>
+        <w:rPr>
+          <w:rStyle w:val="HTMLCode"/>
+        </w:rPr>
+      </w:pPr>
+      <w:r>
+        <w:rPr>
+          <w:rStyle w:val="HTMLCode"/>
+        </w:rPr>
+        <w:t>/cores</w:t>
+      </w:r>
+    </w:p>
+    <w:p>
+      <w:pPr>
+        <w:pStyle w:val="NormalWeb"/>
+      </w:pPr>
+      <w:r>
+        <w:t>For this project, we use the following endpoint to obtain historical launch data:</w:t>
+      </w:r>
+    </w:p>
+    <w:p>
+      <w:pPr>
+        <w:pStyle w:val="HTMLPreformatted"/>
+        <w:rPr>
+          <w:rStyle w:val="HTMLCode"/>
+        </w:rPr>
+      </w:pPr>
+      <w:r>
+        <w:rPr>
+          <w:rStyle w:val="HTMLCode"/>
+        </w:rPr>
+        <w:t>api.spacexdata.com/v4/launches/past</w:t>
+      </w:r>
+    </w:p>
+    <w:p>
+      <w:pPr>
+        <w:pStyle w:val="Heading2"/>
+      </w:pPr>
+      <w:r>
+        <w:t>Retrieving Data from the API</w:t>
+      </w:r>
+    </w:p>
+    <w:p>
+      <w:pPr>
+        <w:pStyle w:val="NormalWeb"/>
+      </w:pPr>
+      <w:r>
+        <w:t xml:space="preserve">To access the launch data, we perform a </w:t>
+      </w:r>
+      <w:r>
+        <w:rPr>
+          <w:rStyle w:val="Strong"/>
+        </w:rPr>
+        <w:t>GET request</w:t>
+      </w:r>
+      <w:r>
+        <w:t xml:space="preserve"> using the </w:t>
+      </w:r>
+      <w:r>
+        <w:rPr>
+          <w:rStyle w:val="HTMLCode"/>
+        </w:rPr>
+        <w:t>requests</w:t>
+      </w:r>
+      <w:r>
+        <w:t xml:space="preserve"> library.</w:t>
+      </w:r>
+    </w:p>
+    <w:p>
+      <w:pPr>
+        <w:pStyle w:val="HTMLPreformatted"/>
+        <w:rPr>
+          <w:rStyle w:val="HTMLCode"/>
+        </w:rPr>
+      </w:pPr>
+      <w:r>
+        <w:rPr>
+          <w:rStyle w:val="HTMLCode"/>
+        </w:rPr>
+        <w:t>import requests</w:t>
+      </w:r>
+    </w:p>
+    <w:p>
+      <w:pPr>
+        <w:pStyle w:val="HTMLPreformatted"/>
+        <w:rPr>
+          <w:rStyle w:val="HTMLCode"/>
+        </w:rPr>
+      </w:pPr>
+    </w:p>
+    <w:p>
+      <w:pPr>
+        <w:pStyle w:val="HTMLPreformatted"/>
+        <w:rPr>
+          <w:rStyle w:val="HTMLCode"/>
+        </w:rPr>
+      </w:pPr>
+      <w:r>
+        <w:rPr>
+          <w:rStyle w:val="HTMLCode"/>
+        </w:rPr>
+        <w:t>response = requests.get('api.spacexdata.com/v4/launches/past')</w:t>
+      </w:r>
+    </w:p>
+    <w:p>
+      <w:pPr>
+        <w:pStyle w:val="NormalWeb"/>
+      </w:pPr>
+      <w:r>
+        <w:t>The response can be viewed using:</w:t>
+      </w:r>
+    </w:p>
+    <w:p>
+      <w:pPr>
+        <w:pStyle w:val="HTMLPreformatted"/>
+        <w:rPr>
+          <w:rStyle w:val="HTMLCode"/>
+        </w:rPr>
+      </w:pPr>
+      <w:r>
+        <w:rPr>
+          <w:rStyle w:val="HTMLCode"/>
+        </w:rPr>
+        <w:t>response.json()</w:t>
+      </w:r>
+    </w:p>
+    <w:p>
+      <w:pPr>
+        <w:pStyle w:val="NormalWeb"/>
+      </w:pPr>
+      <w:r>
+        <w:t xml:space="preserve">The API response is returned in </w:t>
+      </w:r>
+      <w:r>
+        <w:rPr>
+          <w:rStyle w:val="Strong"/>
+        </w:rPr>
+        <w:t>JSON (JavaScript Object Notation)</w:t>
+      </w:r>
+      <w:r>
+        <w:t xml:space="preserve"> format, specifically as a </w:t>
+      </w:r>
+      <w:r>
+        <w:rPr>
+          <w:rStyle w:val="Strong"/>
+        </w:rPr>
+        <w:t>list of JSON objects</w:t>
+      </w:r>
+      <w:r>
+        <w:t>, where each JSON object represents a single launch.</w:t>
+      </w:r>
+    </w:p>
+    <w:p>
+      <w:pPr>
+        <w:pStyle w:val="Heading2"/>
+      </w:pPr>
+      <w:r>
+        <w:t>Converting JSON to a DataFrame</w:t>
+      </w:r>
+    </w:p>
+    <w:p>
+      <w:pPr>
+        <w:pStyle w:val="NormalWeb"/>
+      </w:pPr>
+      <w:r>
+        <w:t>To work with the data efficiently in Python, the JSON data needs to be converted into a Pandas DataFrame.</w:t>
+      </w:r>
+    </w:p>
+    <w:p>
+      <w:pPr>
+        <w:pStyle w:val="NormalWeb"/>
+      </w:pPr>
+      <w:r>
+        <w:lastRenderedPageBreak/>
+        <w:t xml:space="preserve">This can be achieved using the </w:t>
+      </w:r>
+      <w:r>
+        <w:rPr>
+          <w:rStyle w:val="HTMLCode"/>
+        </w:rPr>
+        <w:t>json_normalize()</w:t>
+      </w:r>
+      <w:r>
+        <w:t xml:space="preserve"> function, which converts structured JSON data into a flat table.</w:t>
+      </w:r>
+    </w:p>
+    <w:p>
+      <w:pPr>
+        <w:pStyle w:val="HTMLPreformatted"/>
+        <w:rPr>
+          <w:rStyle w:val="HTMLCode"/>
+        </w:rPr>
+      </w:pPr>
+      <w:r>
+        <w:rPr>
+          <w:rStyle w:val="HTMLCode"/>
+        </w:rPr>
+        <w:t>from pandas import json_normalize</w:t>
+      </w:r>
+    </w:p>
+    <w:p>
+      <w:pPr>
+        <w:pStyle w:val="HTMLPreformatted"/>
+        <w:rPr>
+          <w:rStyle w:val="HTMLCode"/>
+        </w:rPr>
+      </w:pPr>
+    </w:p>
+    <w:p>
+      <w:pPr>
+        <w:pStyle w:val="HTMLPreformatted"/>
+        <w:rPr>
+          <w:rStyle w:val="HTMLCode"/>
+        </w:rPr>
+      </w:pPr>
+      <w:r>
+        <w:rPr>
+          <w:rStyle w:val="HTMLCode"/>
+        </w:rPr>
+        <w:t>df = json_normalize(response.json())</w:t>
+      </w:r>
+    </w:p>
+    <w:p>
+      <w:pPr>
+        <w:pStyle w:val="NormalWeb"/>
+      </w:pPr>
+      <w:r>
+        <w:t xml:space="preserve">The </w:t>
+      </w:r>
+      <w:r>
+        <w:rPr>
+          <w:rStyle w:val="HTMLCode"/>
+        </w:rPr>
+        <w:t>json_normalize()</w:t>
+      </w:r>
+      <w:r>
+        <w:t xml:space="preserve"> function "normalizes" the nested JSON structure and transforms it into a tabular format suitable for analysis.</w:t>
+      </w:r>
+    </w:p>
+    <w:p>
+      <w:pPr>
+        <w:pStyle w:val="Heading2"/>
+      </w:pPr>
+      <w:r>
+        <w:t>Alternative Data Source: Web Scraping</w:t>
+      </w:r>
+    </w:p>
+    <w:p>
+      <w:pPr>
+        <w:pStyle w:val="NormalWeb"/>
+      </w:pPr>
+      <w:r>
+        <w:t xml:space="preserve">Another popular source for obtaining Falcon 9 launch data is through </w:t>
+      </w:r>
+      <w:r>
+        <w:rPr>
+          <w:rStyle w:val="Strong"/>
+        </w:rPr>
+        <w:t>web scraping</w:t>
+      </w:r>
+      <w:r>
+        <w:t xml:space="preserve"> related Wiki pages.</w:t>
+      </w:r>
+    </w:p>
+    <w:p>
+      <w:pPr>
+        <w:pStyle w:val="NormalWeb"/>
+      </w:pPr>
+      <w:r>
+        <w:t xml:space="preserve">In this project, the </w:t>
+      </w:r>
+      <w:r>
+        <w:rPr>
+          <w:rStyle w:val="Strong"/>
+        </w:rPr>
+        <w:t>BeautifulSoup</w:t>
+      </w:r>
+      <w:r>
+        <w:t xml:space="preserve"> package is used to:</w:t>
+      </w:r>
+    </w:p>
+    <w:p>
+      <w:pPr>
+        <w:pStyle w:val="NormalWeb"/>
+        <w:numPr>
+          <w:ilvl w:val="0"/>
+          <w:numId w:val="37"/>
+        </w:numPr>
+      </w:pPr>
+      <w:r>
+        <w:t>Scrape HTML tables containing Falcon 9 launch records.</w:t>
+      </w:r>
+    </w:p>
+    <w:p>
+      <w:pPr>
+        <w:pStyle w:val="NormalWeb"/>
+        <w:numPr>
+          <w:ilvl w:val="0"/>
+          <w:numId w:val="37"/>
+        </w:numPr>
+      </w:pPr>
+      <w:r>
+        <w:t>Parse the data from these tables.</w:t>
+      </w:r>
+    </w:p>
+    <w:p>
+      <w:pPr>
+        <w:pStyle w:val="NormalWeb"/>
+        <w:numPr>
+          <w:ilvl w:val="0"/>
+          <w:numId w:val="37"/>
+        </w:numPr>
+      </w:pPr>
+      <w:r>
+        <w:t>Convert the extracted information into a Pandas DataFrame for further analysis and visualization.</w:t>
+      </w:r>
+    </w:p>
+    <w:p>
+      <w:pPr>
+        <w:pStyle w:val="Heading2"/>
+      </w:pPr>
+      <w:r>
+        <w:t>Data Wrangling Tasks</w:t>
+      </w:r>
+    </w:p>
+    <w:p>
+      <w:pPr>
+        <w:pStyle w:val="NormalWeb"/>
+      </w:pPr>
+      <w:r>
+        <w:t>The raw data needs to be transformed into a clean and meaningful dataset. The major tasks involved are:</w:t>
+      </w:r>
+    </w:p>
+    <w:p>
+      <w:pPr>
+        <w:pStyle w:val="NormalWeb"/>
+        <w:numPr>
+          <w:ilvl w:val="0"/>
+          <w:numId w:val="38"/>
+        </w:numPr>
+      </w:pPr>
+      <w:r>
+        <w:t>Wrangling data using an API</w:t>
+      </w:r>
+    </w:p>
+    <w:p>
+      <w:pPr>
+        <w:pStyle w:val="NormalWeb"/>
+        <w:numPr>
+          <w:ilvl w:val="0"/>
+          <w:numId w:val="38"/>
+        </w:numPr>
+      </w:pPr>
+      <w:r>
+        <w:t>Sampling data</w:t>
+      </w:r>
+    </w:p>
+    <w:p>
+      <w:pPr>
+        <w:pStyle w:val="NormalWeb"/>
+        <w:numPr>
+          <w:ilvl w:val="0"/>
+          <w:numId w:val="38"/>
+        </w:numPr>
+      </w:pPr>
+      <w:r>
+        <w:t>Dealing with null values</w:t>
+      </w:r>
+    </w:p>
+    <w:p>
+      <w:pPr>
+        <w:pStyle w:val="Heading2"/>
+      </w:pPr>
+      <w:r>
+        <w:t>Gathering Additional Information Using API Endpoints</w:t>
+      </w:r>
+    </w:p>
+    <w:p>
+      <w:pPr>
+        <w:pStyle w:val="NormalWeb"/>
+      </w:pPr>
+      <w:r>
+        <w:t xml:space="preserve">Some columns, such as </w:t>
+      </w:r>
+      <w:r>
+        <w:rPr>
+          <w:rStyle w:val="HTMLCode"/>
+        </w:rPr>
+        <w:t>rocket</w:t>
+      </w:r>
+      <w:r>
+        <w:t xml:space="preserve">, contain only an </w:t>
+      </w:r>
+      <w:r>
+        <w:rPr>
+          <w:rStyle w:val="Strong"/>
+        </w:rPr>
+        <w:t>identification number (ID)</w:t>
+      </w:r>
+      <w:r>
+        <w:t xml:space="preserve"> rather than actual information.</w:t>
+      </w:r>
+    </w:p>
+    <w:p>
+      <w:pPr>
+        <w:pStyle w:val="NormalWeb"/>
+      </w:pPr>
+      <w:r>
+        <w:t>This means the API must be queried again using other endpoints to retrieve detailed information for each ID.</w:t>
+      </w:r>
+    </w:p>
+    <w:p>
+      <w:pPr>
+        <w:pStyle w:val="NormalWeb"/>
+      </w:pPr>
+      <w:r>
+        <w:t>The provided functions use the following information:</w:t>
+      </w:r>
+    </w:p>
+    <w:p>
+      <w:pPr>
+        <w:pStyle w:val="NormalWeb"/>
+        <w:numPr>
+          <w:ilvl w:val="0"/>
+          <w:numId w:val="39"/>
+        </w:numPr>
+      </w:pPr>
+      <w:r>
+        <w:t>Booster</w:t>
+      </w:r>
+    </w:p>
+    <w:p>
+      <w:pPr>
+        <w:pStyle w:val="NormalWeb"/>
+        <w:numPr>
+          <w:ilvl w:val="0"/>
+          <w:numId w:val="39"/>
+        </w:numPr>
+      </w:pPr>
+      <w:r>
+        <w:t>Launchpad</w:t>
+      </w:r>
+    </w:p>
+    <w:p>
+      <w:pPr>
+        <w:pStyle w:val="NormalWeb"/>
+        <w:numPr>
+          <w:ilvl w:val="0"/>
+          <w:numId w:val="39"/>
+        </w:numPr>
+      </w:pPr>
+      <w:r>
+        <w:t>Payload</w:t>
+      </w:r>
+    </w:p>
+    <w:p>
+      <w:pPr>
+        <w:pStyle w:val="NormalWeb"/>
+        <w:numPr>
+          <w:ilvl w:val="0"/>
+          <w:numId w:val="39"/>
+        </w:numPr>
+      </w:pPr>
+      <w:r>
+        <w:t>Core</w:t>
+      </w:r>
+    </w:p>
+    <w:p>
+      <w:pPr>
+        <w:pStyle w:val="NormalWeb"/>
+      </w:pPr>
+      <w:r>
+        <w:t>The retrieved data is stored in lists and then used to create the final dataset.</w:t>
+      </w:r>
+    </w:p>
+    <w:p>
+      <w:pPr>
+        <w:pStyle w:val="NormalWeb"/>
+      </w:pPr>
+      <w:r>
+        <w:lastRenderedPageBreak/>
+        <w:drawing>
+          <wp:inline distT="0" distB="0" distL="0" distR="0" wp14:anchorId="348B2BDB" wp14:editId="4D79D926">
+            <wp:extent cx="5731510" cy="2230755"/>
+            <wp:effectExtent l="0" t="0" r="0" b="4445"/>
+            <wp:docPr id="215354252" name="Picture 1"/>
+            <wp:cNvGraphicFramePr>
+              <a:graphicFrameLocks xmlns:a="http://schemas.openxmlformats.org/drawingml/2006/main" noChangeAspect="1"/>
+            </wp:cNvGraphicFramePr>
+            <a:graphic xmlns:a="http://schemas.openxmlformats.org/drawingml/2006/main">
+              <a:graphicData uri="http://schemas.openxmlformats.org/drawingml/2006/picture">
+                <pic:pic xmlns:pic="http://schemas.openxmlformats.org/drawingml/2006/picture">
+                  <pic:nvPicPr>
+                    <pic:cNvPr id="215354252" name=""/>
+                    <pic:cNvPicPr/>
+                  </pic:nvPicPr>
+                  <pic:blipFill>
+                    <a:blip r:embed="rId8"/>
+                    <a:stretch>
+                      <a:fillRect/>
+                    </a:stretch>
+                  </pic:blipFill>
+                  <pic:spPr>
+                    <a:xfrm>
+                      <a:off x="0" y="0"/>
+                      <a:ext cx="5731510" cy="2230755"/>
+                    </a:xfrm>
+                    <a:prstGeom prst="rect">
+                      <a:avLst/>
+                    </a:prstGeom>
+                  </pic:spPr>
+                </pic:pic>
+              </a:graphicData>
+            </a:graphic>
+          </wp:inline>
+        </w:drawing>
+      </w:r>
+    </w:p>
+    <w:p>
+      <w:pPr>
+        <w:pStyle w:val="Heading2"/>
+      </w:pPr>
+      <w:r>
+        <w:t>Sampling Data</w:t>
+      </w:r>
+    </w:p>
+    <w:p>
+      <w:pPr>
+        <w:pStyle w:val="NormalWeb"/>
+      </w:pPr>
+      <w:r>
+        <w:t>The launch dataset includes information for both:</w:t>
+      </w:r>
+    </w:p>
+    <w:p>
+      <w:pPr>
+        <w:pStyle w:val="NormalWeb"/>
+        <w:numPr>
+          <w:ilvl w:val="0"/>
+          <w:numId w:val="40"/>
+        </w:numPr>
+      </w:pPr>
+      <w:r>
+        <w:t>Falcon 1</w:t>
+      </w:r>
+    </w:p>
+    <w:p>
+      <w:pPr>
+        <w:pStyle w:val="NormalWeb"/>
+        <w:numPr>
+          <w:ilvl w:val="0"/>
+          <w:numId w:val="40"/>
+        </w:numPr>
+      </w:pPr>
+      <w:r>
+        <w:t>Falcon 9</w:t>
+      </w:r>
+    </w:p>
+    <w:p>
+      <w:pPr>
+        <w:pStyle w:val="NormalWeb"/>
+      </w:pPr>
+      <w:r>
+        <w:t xml:space="preserve">However, the project only focuses on </w:t>
+      </w:r>
+      <w:r>
+        <w:rPr>
+          <w:rStyle w:val="Strong"/>
+        </w:rPr>
+        <w:t>Falcon 9 launches</w:t>
+      </w:r>
+      <w:r>
+        <w:t>.</w:t>
+      </w:r>
+    </w:p>
+    <w:p>
+      <w:pPr>
+        <w:pStyle w:val="NormalWeb"/>
+      </w:pPr>
+      <w:r>
+        <w:t xml:space="preserve">Therefore, the data must be filtered to remove all </w:t>
+      </w:r>
+      <w:r>
+        <w:rPr>
+          <w:rStyle w:val="Strong"/>
+        </w:rPr>
+        <w:t>Falcon 1</w:t>
+      </w:r>
+      <w:r>
+        <w:t xml:space="preserve"> launches.</w:t>
+      </w:r>
+    </w:p>
+    <w:p>
+      <w:pPr>
+        <w:pStyle w:val="Heading2"/>
+      </w:pPr>
+      <w:r>
+        <w:t>Handling Null Values</w:t>
+      </w:r>
+    </w:p>
+    <w:p>
+      <w:pPr>
+        <w:pStyle w:val="NormalWeb"/>
+      </w:pPr>
+      <w:r>
+        <w:t xml:space="preserve">Real-world data is rarely perfect and often contains </w:t>
+      </w:r>
+      <w:r>
+        <w:rPr>
+          <w:rStyle w:val="Strong"/>
+        </w:rPr>
+        <w:t>NULL values (missing values)</w:t>
+      </w:r>
+      <w:r>
+        <w:t>.</w:t>
+      </w:r>
+    </w:p>
+    <w:p>
+      <w:pPr>
+        <w:pStyle w:val="NormalWeb"/>
+      </w:pPr>
+      <w:r>
+        <w:t>These missing values must be handled to make the dataset suitable for analysis.</w:t>
+      </w:r>
+    </w:p>
+    <w:p>
+      <w:pPr>
+        <w:pStyle w:val="Heading3"/>
+      </w:pPr>
+      <w:r>
+        <w:t>Handling NULL Values in PayloadMass</w:t>
+      </w:r>
+    </w:p>
+    <w:p>
+      <w:pPr>
+        <w:pStyle w:val="NormalWeb"/>
+      </w:pPr>
+      <w:r>
+        <w:t xml:space="preserve">The </w:t>
+      </w:r>
+      <w:r>
+        <w:rPr>
+          <w:rStyle w:val="HTMLCode"/>
+        </w:rPr>
+        <w:t>PayloadMass</w:t>
+      </w:r>
+      <w:r>
+        <w:t xml:space="preserve"> column contains NULL values.</w:t>
+      </w:r>
+    </w:p>
+    <w:p>
+      <w:pPr>
+        <w:pStyle w:val="NormalWeb"/>
+      </w:pPr>
+      <w:r>
+        <w:t>The required steps are:</w:t>
+      </w:r>
+    </w:p>
+    <w:p>
+      <w:pPr>
+        <w:pStyle w:val="NormalWeb"/>
+        <w:numPr>
+          <w:ilvl w:val="0"/>
+          <w:numId w:val="41"/>
+        </w:numPr>
+      </w:pPr>
+      <w:r>
+        <w:t xml:space="preserve">Calculate the mean of the </w:t>
+      </w:r>
+      <w:r>
+        <w:rPr>
+          <w:rStyle w:val="HTMLCode"/>
+        </w:rPr>
+        <w:t>PayloadMass</w:t>
+      </w:r>
+      <w:r>
+        <w:t xml:space="preserve"> column.</w:t>
+      </w:r>
+    </w:p>
+    <w:p>
+      <w:pPr>
+        <w:pStyle w:val="NormalWeb"/>
+        <w:numPr>
+          <w:ilvl w:val="0"/>
+          <w:numId w:val="41"/>
+        </w:numPr>
+      </w:pPr>
+      <w:r>
+        <w:t>Replace the NULL values with the calculated mean.</w:t>
+      </w:r>
+    </w:p>
+    <w:p>
+      <w:pPr>
+        <w:pStyle w:val="NormalWeb"/>
+      </w:pPr>
+      <w:r>
+        <w:t>Example:</w:t>
+      </w:r>
+    </w:p>
+    <w:p>
+      <w:pPr>
+        <w:pStyle w:val="HTMLPreformatted"/>
+        <w:rPr>
+          <w:rStyle w:val="HTMLCode"/>
+        </w:rPr>
+      </w:pPr>
+      <w:r>
+        <w:rPr>
+          <w:rStyle w:val="HTMLCode"/>
+        </w:rPr>
+        <w:t>mean_payload = df['PayloadMass'].mean()</w:t>
+      </w:r>
+    </w:p>
+    <w:p>
+      <w:pPr>
+        <w:pStyle w:val="HTMLPreformatted"/>
+        <w:rPr>
+          <w:rStyle w:val="HTMLCode"/>
+        </w:rPr>
+      </w:pPr>
+      <w:r>
+        <w:rPr>
+          <w:rStyle w:val="HTMLCode"/>
+        </w:rPr>
+        <w:t>df['PayloadMass'].fillna(mean_payload, inplace=True)</w:t>
+      </w:r>
+    </w:p>
+    <w:p>
+      <w:pPr>
+        <w:pStyle w:val="Heading3"/>
+      </w:pPr>
+      <w:r>
+        <w:t>Handling NULL Values in LandingPad</w:t>
+      </w:r>
+    </w:p>
+    <w:p>
+      <w:pPr>
+        <w:pStyle w:val="NormalWeb"/>
+      </w:pPr>
+      <w:r>
+        <w:t xml:space="preserve">The </w:t>
+      </w:r>
+      <w:r>
+        <w:rPr>
+          <w:rStyle w:val="HTMLCode"/>
+        </w:rPr>
+        <w:t>LandingPad</w:t>
+      </w:r>
+      <w:r>
+        <w:t xml:space="preserve"> column is intentionally left with NULL values because a NULL value indicates that </w:t>
+      </w:r>
+      <w:r>
+        <w:rPr>
+          <w:rStyle w:val="Strong"/>
+        </w:rPr>
+        <w:t>no landing pad was used</w:t>
+      </w:r>
+      <w:r>
+        <w:t>.</w:t>
+      </w:r>
+    </w:p>
+    <w:p>
+      <w:pPr>
+        <w:pStyle w:val="NormalWeb"/>
+      </w:pPr>
+      <w:r>
+        <w:lastRenderedPageBreak/>
+        <w:t>These NULL values will be handled later using:</w:t>
+      </w:r>
+    </w:p>
+    <w:p>
+      <w:pPr>
+        <w:pStyle w:val="NormalWeb"/>
+        <w:numPr>
+          <w:ilvl w:val="0"/>
+          <w:numId w:val="42"/>
+        </w:numPr>
+      </w:pPr>
+      <w:r>
+        <w:t>One-Hot Encoding (a technique that converts categorical values into numerical columns).</w:t>
+      </w:r>
+    </w:p>
+    <w:p>
+      <w:pPr>
+        <w:pStyle w:val="Heading2"/>
+      </w:pPr>
+      <w:r>
+        <w:t>Key Takeaways</w:t>
+      </w:r>
+    </w:p>
+    <w:p>
+      <w:pPr>
+        <w:pStyle w:val="NormalWeb"/>
+        <w:numPr>
+          <w:ilvl w:val="0"/>
+          <w:numId w:val="43"/>
+        </w:numPr>
+      </w:pPr>
+      <w:r>
+        <w:t>SpaceX launch data is collected using the SpaceX REST API.</w:t>
+      </w:r>
+    </w:p>
+    <w:p>
+      <w:pPr>
+        <w:pStyle w:val="NormalWeb"/>
+        <w:numPr>
+          <w:ilvl w:val="0"/>
+          <w:numId w:val="43"/>
+        </w:numPr>
+      </w:pPr>
+      <w:r>
+        <w:t xml:space="preserve">The endpoint </w:t>
+      </w:r>
+      <w:r>
+        <w:rPr>
+          <w:rStyle w:val="HTMLCode"/>
+        </w:rPr>
+        <w:t>api.spacexdata.com/v4/launches/past</w:t>
+      </w:r>
+      <w:r>
+        <w:t xml:space="preserve"> provides historical launch information.</w:t>
+      </w:r>
+    </w:p>
+    <w:p>
+      <w:pPr>
+        <w:pStyle w:val="NormalWeb"/>
+        <w:numPr>
+          <w:ilvl w:val="0"/>
+          <w:numId w:val="43"/>
+        </w:numPr>
+      </w:pPr>
+      <w:r>
+        <w:t>API responses are returned as JSON data.</w:t>
+      </w:r>
+    </w:p>
+    <w:p>
+      <w:pPr>
+        <w:pStyle w:val="NormalWeb"/>
+        <w:numPr>
+          <w:ilvl w:val="0"/>
+          <w:numId w:val="43"/>
+        </w:numPr>
+      </w:pPr>
+      <w:r>
+        <w:rPr>
+          <w:rStyle w:val="HTMLCode"/>
+        </w:rPr>
+        <w:t>json_normalize()</w:t>
+      </w:r>
+      <w:r>
+        <w:t xml:space="preserve"> is used to convert JSON into a tabular DataFrame.</w:t>
+      </w:r>
+    </w:p>
+    <w:p>
+      <w:pPr>
+        <w:pStyle w:val="NormalWeb"/>
+        <w:numPr>
+          <w:ilvl w:val="0"/>
+          <w:numId w:val="43"/>
+        </w:numPr>
+      </w:pPr>
+      <w:r>
+        <w:t>BeautifulSoup can be used to scrape additional Falcon 9 launch records from web pages.</w:t>
+      </w:r>
+    </w:p>
+    <w:p>
+      <w:pPr>
+        <w:pStyle w:val="NormalWeb"/>
+        <w:numPr>
+          <w:ilvl w:val="0"/>
+          <w:numId w:val="43"/>
+        </w:numPr>
+      </w:pPr>
+      <w:r>
+        <w:t>Data wrangling involves:</w:t>
+      </w:r>
+    </w:p>
+    <w:p>
+      <w:pPr>
+        <w:pStyle w:val="NormalWeb"/>
+        <w:numPr>
+          <w:ilvl w:val="1"/>
+          <w:numId w:val="43"/>
+        </w:numPr>
+      </w:pPr>
+      <w:r>
+        <w:t>Gathering additional information through API endpoints</w:t>
+      </w:r>
+    </w:p>
+    <w:p>
+      <w:pPr>
+        <w:pStyle w:val="NormalWeb"/>
+        <w:numPr>
+          <w:ilvl w:val="1"/>
+          <w:numId w:val="43"/>
+        </w:numPr>
+      </w:pPr>
+      <w:r>
+        <w:t>Filtering out Falcon 1 launches</w:t>
+      </w:r>
+    </w:p>
+    <w:p>
+      <w:pPr>
+        <w:pStyle w:val="NormalWeb"/>
+        <w:numPr>
+          <w:ilvl w:val="1"/>
+          <w:numId w:val="43"/>
+        </w:numPr>
+      </w:pPr>
+      <w:r>
+        <w:t>Handling missing values</w:t>
+      </w:r>
+    </w:p>
+    <w:p>
+      <w:pPr>
+        <w:pStyle w:val="NormalWeb"/>
+        <w:numPr>
+          <w:ilvl w:val="0"/>
+          <w:numId w:val="43"/>
+        </w:numPr>
+      </w:pPr>
+      <w:r>
+        <w:t xml:space="preserve">NULL values in </w:t>
+      </w:r>
+      <w:r>
+        <w:rPr>
+          <w:rStyle w:val="HTMLCode"/>
+        </w:rPr>
+        <w:t>PayloadMass</w:t>
+      </w:r>
+      <w:r>
+        <w:t xml:space="preserve"> are replaced with the mean.</w:t>
+      </w:r>
+    </w:p>
+    <w:p>
+      <w:pPr>
+        <w:pStyle w:val="NormalWeb"/>
+        <w:numPr>
+          <w:ilvl w:val="0"/>
+          <w:numId w:val="43"/>
+        </w:numPr>
+      </w:pPr>
+      <w:r>
+        <w:t xml:space="preserve">NULL values in </w:t>
+      </w:r>
+      <w:r>
+        <w:rPr>
+          <w:rStyle w:val="HTMLCode"/>
+        </w:rPr>
+        <w:t>LandingPad</w:t>
+      </w:r>
+      <w:r>
+        <w:t xml:space="preserve"> are preserved and handled later using one-hot encoding.</w:t>
+      </w:r>
+    </w:p>
+    <w:p>
+      <w:pPr>
         <w:spacing w:after="0" w:line="240" w:lineRule="auto"/>
         <w:jc w:val="both"/>
         <w:rPr>
@@ -877,6 +2000,155 @@
 <file path=word/numbering.xml><?xml version="1.0" encoding="utf-8"?>
 <w:numbering xmlns:wpc="http://schemas.microsoft.com/office/word/2010/wordprocessingCanvas" xmlns:cx="http://schemas.microsoft.com/office/drawing/2014/chartex" xmlns:cx1="http://schemas.microsoft.com/office/drawing/2015/9/8/chartex" xmlns:cx2="http://schemas.microsoft.com/office/drawing/2015/10/21/chartex" xmlns:cx3="http://schemas.microsoft.com/office/drawing/2016/5/9/chartex" xmlns:cx4="http://schemas.microsoft.com/office/drawing/2016/5/10/chartex" xmlns:cx5="http://schemas.microsoft.com/office/drawing/2016/5/11/chartex" xmlns:cx6="http://schemas.microsoft.com/office/drawing/2016/5/12/chartex" xmlns:cx7="http://schemas.microsoft.com/office/drawing/2016/5/13/chartex" xmlns:cx8="http://schemas.microsoft.com/office/drawing/2016/5/14/chartex" xmlns:mc="http://schemas.openxmlformats.org/markup-compatibility/2006" xmlns:aink="http://schemas.microsoft.com/office/drawing/2016/ink" xmlns:am3d="http://schemas.microsoft.com/office/drawing/2017/model3d" xmlns:o="urn:schemas-microsoft-com:office:office" xmlns:oel="http://schemas.microsoft.com/office/2019/extlst" xmlns:r="http://schemas.openxmlformats.org/officeDocument/2006/relationships" xmlns:m="http://schemas.openxmlformats.org/officeDocument/2006/math" xmlns:v="urn:schemas-microsoft-com:vml" xmlns:wp14="http://schemas.microsoft.com/office/word/2010/wordprocessingDrawing" xmlns:wp="http://schemas.openxmlformats.org/drawingml/2006/wordprocessingDrawing" xmlns:w10="urn:schemas-microsoft-com:office:word" xmlns:w="http://schemas.openxmlformats.org/wordprocessingml/2006/main" xmlns:w14="http://schemas.microsoft.com/office/word/2010/wordml" xmlns:w15="http://schemas.microsoft.com/office/word/2012/wordml" xmlns:w16cex="http://schemas.microsoft.com/office/word/2018/wordml/cex" xmlns:w16cid="http://schemas.microsoft.com/office/word/2016/wordml/cid" xmlns:w16="http://schemas.microsoft.com/office/word/2018/wordml" xmlns:w16du="http://schemas.microsoft.com/office/word/2023/wordml/word16du" xmlns:w16sdtdh="http://schemas.microsoft.com/office/word/2020/wordml/sdtdatahash" xmlns:w16sdtfl="http://schemas.microsoft.com/office/word/2024/wordml/sdtformatlock" xmlns:w16se="http://schemas.microsoft.com/office/word/2015/wordml/symex" xmlns:wpg="http://schemas.microsoft.com/office/word/2010/wordprocessingGroup" xmlns:wpi="http://schemas.microsoft.com/office/word/2010/wordprocessingInk" xmlns:wne="http://schemas.microsoft.com/office/word/2006/wordml" xmlns:wps="http://schemas.microsoft.com/office/word/2010/wordprocessingShape" mc:Ignorable="w14 w15 w16se w16cid w16 w16cex w16sdtdh w16sdtfl w16du wp14">
   <w:abstractNum w:abstractNumId="0" w15:restartNumberingAfterBreak="0">
+    <w:nsid w:val="051B1289"/>
+    <w:multiLevelType w:val="multilevel"/>
+    <w:tmpl w:val="85047BD8"/>
+    <w:lvl w:ilvl="0">
+      <w:start w:val="1"/>
+      <w:numFmt w:val="bullet"/>
+      <w:lvlText w:val=""/>
+      <w:lvlJc w:val="left"/>
+      <w:pPr>
+        <w:tabs>
+          <w:tab w:val="num" w:pos="720"/>
+        </w:tabs>
+        <w:ind w:left="720" w:hanging="360"/>
+      </w:pPr>
+      <w:rPr>
+        <w:rFonts w:ascii="Symbol" w:hAnsi="Symbol" w:hint="default"/>
+        <w:sz w:val="20"/>
+      </w:rPr>
+    </w:lvl>
+    <w:lvl w:ilvl="1" w:tentative="1">
+      <w:start w:val="1"/>
+      <w:numFmt w:val="bullet"/>
+      <w:lvlText w:val="o"/>
+      <w:lvlJc w:val="left"/>
+      <w:pPr>
+        <w:tabs>
+          <w:tab w:val="num" w:pos="1440"/>
+        </w:tabs>
+        <w:ind w:left="1440" w:hanging="360"/>
+      </w:pPr>
+      <w:rPr>
+        <w:rFonts w:ascii="Courier New" w:hAnsi="Courier New" w:hint="default"/>
+        <w:sz w:val="20"/>
+      </w:rPr>
+    </w:lvl>
+    <w:lvl w:ilvl="2" w:tentative="1">
+      <w:start w:val="1"/>
+      <w:numFmt w:val="bullet"/>
+      <w:lvlText w:val=""/>
+      <w:lvlJc w:val="left"/>
+      <w:pPr>
+        <w:tabs>
+          <w:tab w:val="num" w:pos="2160"/>
+        </w:tabs>
+        <w:ind w:left="2160" w:hanging="360"/>
+      </w:pPr>
+      <w:rPr>
+        <w:rFonts w:ascii="Wingdings" w:hAnsi="Wingdings" w:hint="default"/>
+        <w:sz w:val="20"/>
+      </w:rPr>
+    </w:lvl>
+    <w:lvl w:ilvl="3" w:tentative="1">
+      <w:start w:val="1"/>
+      <w:numFmt w:val="bullet"/>
+      <w:lvlText w:val=""/>
+      <w:lvlJc w:val="left"/>
+      <w:pPr>
+        <w:tabs>
+          <w:tab w:val="num" w:pos="2880"/>
+        </w:tabs>
+        <w:ind w:left="2880" w:hanging="360"/>
+      </w:pPr>
+      <w:rPr>
+        <w:rFonts w:ascii="Wingdings" w:hAnsi="Wingdings" w:hint="default"/>
+        <w:sz w:val="20"/>
+      </w:rPr>
+    </w:lvl>
+    <w:lvl w:ilvl="4" w:tentative="1">
+      <w:start w:val="1"/>
+      <w:numFmt w:val="bullet"/>
+      <w:lvlText w:val=""/>
+      <w:lvlJc w:val="left"/>
+      <w:pPr>
+        <w:tabs>
+          <w:tab w:val="num" w:pos="3600"/>
+        </w:tabs>
+        <w:ind w:left="3600" w:hanging="360"/>
+      </w:pPr>
+      <w:rPr>
+        <w:rFonts w:ascii="Wingdings" w:hAnsi="Wingdings" w:hint="default"/>
+        <w:sz w:val="20"/>
+      </w:rPr>
+    </w:lvl>
+    <w:lvl w:ilvl="5" w:tentative="1">
+      <w:start w:val="1"/>
+      <w:numFmt w:val="bullet"/>
+      <w:lvlText w:val=""/>
+      <w:lvlJc w:val="left"/>
+      <w:pPr>
+        <w:tabs>
+          <w:tab w:val="num" w:pos="4320"/>
+        </w:tabs>
+        <w:ind w:left="4320" w:hanging="360"/>
+      </w:pPr>
+      <w:rPr>
+        <w:rFonts w:ascii="Wingdings" w:hAnsi="Wingdings" w:hint="default"/>
+        <w:sz w:val="20"/>
+      </w:rPr>
+    </w:lvl>
+    <w:lvl w:ilvl="6" w:tentative="1">
+      <w:start w:val="1"/>
+      <w:numFmt w:val="bullet"/>
+      <w:lvlText w:val=""/>
+      <w:lvlJc w:val="left"/>
+      <w:pPr>
+        <w:tabs>
+          <w:tab w:val="num" w:pos="5040"/>
+        </w:tabs>
+        <w:ind w:left="5040" w:hanging="360"/>
+      </w:pPr>
+      <w:rPr>
+        <w:rFonts w:ascii="Wingdings" w:hAnsi="Wingdings" w:hint="default"/>
+        <w:sz w:val="20"/>
+      </w:rPr>
+    </w:lvl>
+    <w:lvl w:ilvl="7" w:tentative="1">
+      <w:start w:val="1"/>
+      <w:numFmt w:val="bullet"/>
+      <w:lvlText w:val=""/>
+      <w:lvlJc w:val="left"/>
+      <w:pPr>
+        <w:tabs>
+          <w:tab w:val="num" w:pos="5760"/>
+        </w:tabs>
+        <w:ind w:left="5760" w:hanging="360"/>
+      </w:pPr>
+      <w:rPr>
+        <w:rFonts w:ascii="Wingdings" w:hAnsi="Wingdings" w:hint="default"/>
+        <w:sz w:val="20"/>
+      </w:rPr>
+    </w:lvl>
+    <w:lvl w:ilvl="8" w:tentative="1">
+      <w:start w:val="1"/>
+      <w:numFmt w:val="bullet"/>
+      <w:lvlText w:val=""/>
+      <w:lvlJc w:val="left"/>
+      <w:pPr>
+        <w:tabs>
+          <w:tab w:val="num" w:pos="6480"/>
+        </w:tabs>
+        <w:ind w:left="6480" w:hanging="360"/>
+      </w:pPr>
+      <w:rPr>
+        <w:rFonts w:ascii="Wingdings" w:hAnsi="Wingdings" w:hint="default"/>
+        <w:sz w:val="20"/>
+      </w:rPr>
+    </w:lvl>
+  </w:abstractNum>
+  <w:abstractNum w:abstractNumId="1" w15:restartNumberingAfterBreak="0">
     <w:nsid w:val="0E8548FA"/>
     <w:multiLevelType w:val="multilevel"/>
     <w:tmpl w:val="E9A0414E"/>
@@ -1025,7 +2297,7 @@
       </w:rPr>
     </w:lvl>
   </w:abstractNum>
-  <w:abstractNum w:abstractNumId="1" w15:restartNumberingAfterBreak="0">
+  <w:abstractNum w:abstractNumId="2" w15:restartNumberingAfterBreak="0">
     <w:nsid w:val="0E9F1F99"/>
     <w:multiLevelType w:val="multilevel"/>
     <w:tmpl w:val="CD8A9FBE"/>
@@ -1174,7 +2446,305 @@
       </w:rPr>
     </w:lvl>
   </w:abstractNum>
-  <w:abstractNum w:abstractNumId="2" w15:restartNumberingAfterBreak="0">
+  <w:abstractNum w:abstractNumId="3" w15:restartNumberingAfterBreak="0">
+    <w:nsid w:val="1645048A"/>
+    <w:multiLevelType w:val="multilevel"/>
+    <w:tmpl w:val="83804A88"/>
+    <w:lvl w:ilvl="0">
+      <w:start w:val="1"/>
+      <w:numFmt w:val="bullet"/>
+      <w:lvlText w:val=""/>
+      <w:lvlJc w:val="left"/>
+      <w:pPr>
+        <w:tabs>
+          <w:tab w:val="num" w:pos="720"/>
+        </w:tabs>
+        <w:ind w:left="720" w:hanging="360"/>
+      </w:pPr>
+      <w:rPr>
+        <w:rFonts w:ascii="Symbol" w:hAnsi="Symbol" w:hint="default"/>
+        <w:sz w:val="20"/>
+      </w:rPr>
+    </w:lvl>
+    <w:lvl w:ilvl="1" w:tentative="1">
+      <w:start w:val="1"/>
+      <w:numFmt w:val="bullet"/>
+      <w:lvlText w:val="o"/>
+      <w:lvlJc w:val="left"/>
+      <w:pPr>
+        <w:tabs>
+          <w:tab w:val="num" w:pos="1440"/>
+        </w:tabs>
+        <w:ind w:left="1440" w:hanging="360"/>
+      </w:pPr>
+      <w:rPr>
+        <w:rFonts w:ascii="Courier New" w:hAnsi="Courier New" w:hint="default"/>
+        <w:sz w:val="20"/>
+      </w:rPr>
+    </w:lvl>
+    <w:lvl w:ilvl="2" w:tentative="1">
+      <w:start w:val="1"/>
+      <w:numFmt w:val="bullet"/>
+      <w:lvlText w:val=""/>
+      <w:lvlJc w:val="left"/>
+      <w:pPr>
+        <w:tabs>
+          <w:tab w:val="num" w:pos="2160"/>
+        </w:tabs>
+        <w:ind w:left="2160" w:hanging="360"/>
+      </w:pPr>
+      <w:rPr>
+        <w:rFonts w:ascii="Wingdings" w:hAnsi="Wingdings" w:hint="default"/>
+        <w:sz w:val="20"/>
+      </w:rPr>
+    </w:lvl>
+    <w:lvl w:ilvl="3" w:tentative="1">
+      <w:start w:val="1"/>
+      <w:numFmt w:val="bullet"/>
+      <w:lvlText w:val=""/>
+      <w:lvlJc w:val="left"/>
+      <w:pPr>
+        <w:tabs>
+          <w:tab w:val="num" w:pos="2880"/>
+        </w:tabs>
+        <w:ind w:left="2880" w:hanging="360"/>
+      </w:pPr>
+      <w:rPr>
+        <w:rFonts w:ascii="Wingdings" w:hAnsi="Wingdings" w:hint="default"/>
+        <w:sz w:val="20"/>
+      </w:rPr>
+    </w:lvl>
+    <w:lvl w:ilvl="4" w:tentative="1">
+      <w:start w:val="1"/>
+      <w:numFmt w:val="bullet"/>
+      <w:lvlText w:val=""/>
+      <w:lvlJc w:val="left"/>
+      <w:pPr>
+        <w:tabs>
+          <w:tab w:val="num" w:pos="3600"/>
+        </w:tabs>
+        <w:ind w:left="3600" w:hanging="360"/>
+      </w:pPr>
+      <w:rPr>
+        <w:rFonts w:ascii="Wingdings" w:hAnsi="Wingdings" w:hint="default"/>
+        <w:sz w:val="20"/>
+      </w:rPr>
+    </w:lvl>
+    <w:lvl w:ilvl="5" w:tentative="1">
+      <w:start w:val="1"/>
+      <w:numFmt w:val="bullet"/>
+      <w:lvlText w:val=""/>
+      <w:lvlJc w:val="left"/>
+      <w:pPr>
+        <w:tabs>
+          <w:tab w:val="num" w:pos="4320"/>
+        </w:tabs>
+        <w:ind w:left="4320" w:hanging="360"/>
+      </w:pPr>
+      <w:rPr>
+        <w:rFonts w:ascii="Wingdings" w:hAnsi="Wingdings" w:hint="default"/>
+        <w:sz w:val="20"/>
+      </w:rPr>
+    </w:lvl>
+    <w:lvl w:ilvl="6" w:tentative="1">
+      <w:start w:val="1"/>
+      <w:numFmt w:val="bullet"/>
+      <w:lvlText w:val=""/>
+      <w:lvlJc w:val="left"/>
+      <w:pPr>
+        <w:tabs>
+          <w:tab w:val="num" w:pos="5040"/>
+        </w:tabs>
+        <w:ind w:left="5040" w:hanging="360"/>
+      </w:pPr>
+      <w:rPr>
+        <w:rFonts w:ascii="Wingdings" w:hAnsi="Wingdings" w:hint="default"/>
+        <w:sz w:val="20"/>
+      </w:rPr>
+    </w:lvl>
+    <w:lvl w:ilvl="7" w:tentative="1">
+      <w:start w:val="1"/>
+      <w:numFmt w:val="bullet"/>
+      <w:lvlText w:val=""/>
+      <w:lvlJc w:val="left"/>
+      <w:pPr>
+        <w:tabs>
+          <w:tab w:val="num" w:pos="5760"/>
+        </w:tabs>
+        <w:ind w:left="5760" w:hanging="360"/>
+      </w:pPr>
+      <w:rPr>
+        <w:rFonts w:ascii="Wingdings" w:hAnsi="Wingdings" w:hint="default"/>
+        <w:sz w:val="20"/>
+      </w:rPr>
+    </w:lvl>
+    <w:lvl w:ilvl="8" w:tentative="1">
+      <w:start w:val="1"/>
+      <w:numFmt w:val="bullet"/>
+      <w:lvlText w:val=""/>
+      <w:lvlJc w:val="left"/>
+      <w:pPr>
+        <w:tabs>
+          <w:tab w:val="num" w:pos="6480"/>
+        </w:tabs>
+        <w:ind w:left="6480" w:hanging="360"/>
+      </w:pPr>
+      <w:rPr>
+        <w:rFonts w:ascii="Wingdings" w:hAnsi="Wingdings" w:hint="default"/>
+        <w:sz w:val="20"/>
+      </w:rPr>
+    </w:lvl>
+  </w:abstractNum>
+  <w:abstractNum w:abstractNumId="4" w15:restartNumberingAfterBreak="0">
+    <w:nsid w:val="17C75640"/>
+    <w:multiLevelType w:val="multilevel"/>
+    <w:tmpl w:val="50CC3204"/>
+    <w:lvl w:ilvl="0">
+      <w:start w:val="1"/>
+      <w:numFmt w:val="bullet"/>
+      <w:lvlText w:val=""/>
+      <w:lvlJc w:val="left"/>
+      <w:pPr>
+        <w:tabs>
+          <w:tab w:val="num" w:pos="720"/>
+        </w:tabs>
+        <w:ind w:left="720" w:hanging="360"/>
+      </w:pPr>
+      <w:rPr>
+        <w:rFonts w:ascii="Symbol" w:hAnsi="Symbol" w:hint="default"/>
+        <w:sz w:val="20"/>
+      </w:rPr>
+    </w:lvl>
+    <w:lvl w:ilvl="1" w:tentative="1">
+      <w:start w:val="1"/>
+      <w:numFmt w:val="bullet"/>
+      <w:lvlText w:val="o"/>
+      <w:lvlJc w:val="left"/>
+      <w:pPr>
+        <w:tabs>
+          <w:tab w:val="num" w:pos="1440"/>
+        </w:tabs>
+        <w:ind w:left="1440" w:hanging="360"/>
+      </w:pPr>
+      <w:rPr>
+        <w:rFonts w:ascii="Courier New" w:hAnsi="Courier New" w:hint="default"/>
+        <w:sz w:val="20"/>
+      </w:rPr>
+    </w:lvl>
+    <w:lvl w:ilvl="2" w:tentative="1">
+      <w:start w:val="1"/>
+      <w:numFmt w:val="bullet"/>
+      <w:lvlText w:val=""/>
+      <w:lvlJc w:val="left"/>
+      <w:pPr>
+        <w:tabs>
+          <w:tab w:val="num" w:pos="2160"/>
+        </w:tabs>
+        <w:ind w:left="2160" w:hanging="360"/>
+      </w:pPr>
+      <w:rPr>
+        <w:rFonts w:ascii="Wingdings" w:hAnsi="Wingdings" w:hint="default"/>
+        <w:sz w:val="20"/>
+      </w:rPr>
+    </w:lvl>
+    <w:lvl w:ilvl="3" w:tentative="1">
+      <w:start w:val="1"/>
+      <w:numFmt w:val="bullet"/>
+      <w:lvlText w:val=""/>
+      <w:lvlJc w:val="left"/>
+      <w:pPr>
+        <w:tabs>
+          <w:tab w:val="num" w:pos="2880"/>
+        </w:tabs>
+        <w:ind w:left="2880" w:hanging="360"/>
+      </w:pPr>
+      <w:rPr>
+        <w:rFonts w:ascii="Wingdings" w:hAnsi="Wingdings" w:hint="default"/>
+        <w:sz w:val="20"/>
+      </w:rPr>
+    </w:lvl>
+    <w:lvl w:ilvl="4" w:tentative="1">
+      <w:start w:val="1"/>
+      <w:numFmt w:val="bullet"/>
+      <w:lvlText w:val=""/>
+      <w:lvlJc w:val="left"/>
+      <w:pPr>
+        <w:tabs>
+          <w:tab w:val="num" w:pos="3600"/>
+        </w:tabs>
+        <w:ind w:left="3600" w:hanging="360"/>
+      </w:pPr>
+      <w:rPr>
+        <w:rFonts w:ascii="Wingdings" w:hAnsi="Wingdings" w:hint="default"/>
+        <w:sz w:val="20"/>
+      </w:rPr>
+    </w:lvl>
+    <w:lvl w:ilvl="5" w:tentative="1">
+      <w:start w:val="1"/>
+      <w:numFmt w:val="bullet"/>
+      <w:lvlText w:val=""/>
+      <w:lvlJc w:val="left"/>
+      <w:pPr>
+        <w:tabs>
+          <w:tab w:val="num" w:pos="4320"/>
+        </w:tabs>
+        <w:ind w:left="4320" w:hanging="360"/>
+      </w:pPr>
+      <w:rPr>
+        <w:rFonts w:ascii="Wingdings" w:hAnsi="Wingdings" w:hint="default"/>
+        <w:sz w:val="20"/>
+      </w:rPr>
+    </w:lvl>
+    <w:lvl w:ilvl="6" w:tentative="1">
+      <w:start w:val="1"/>
+      <w:numFmt w:val="bullet"/>
+      <w:lvlText w:val=""/>
+      <w:lvlJc w:val="left"/>
+      <w:pPr>
+        <w:tabs>
+          <w:tab w:val="num" w:pos="5040"/>
+        </w:tabs>
+        <w:ind w:left="5040" w:hanging="360"/>
+      </w:pPr>
+      <w:rPr>
+        <w:rFonts w:ascii="Wingdings" w:hAnsi="Wingdings" w:hint="default"/>
+        <w:sz w:val="20"/>
+      </w:rPr>
+    </w:lvl>
+    <w:lvl w:ilvl="7" w:tentative="1">
+      <w:start w:val="1"/>
+      <w:numFmt w:val="bullet"/>
+      <w:lvlText w:val=""/>
+      <w:lvlJc w:val="left"/>
+      <w:pPr>
+        <w:tabs>
+          <w:tab w:val="num" w:pos="5760"/>
+        </w:tabs>
+        <w:ind w:left="5760" w:hanging="360"/>
+      </w:pPr>
+      <w:rPr>
+        <w:rFonts w:ascii="Wingdings" w:hAnsi="Wingdings" w:hint="default"/>
+        <w:sz w:val="20"/>
+      </w:rPr>
+    </w:lvl>
+    <w:lvl w:ilvl="8" w:tentative="1">
+      <w:start w:val="1"/>
+      <w:numFmt w:val="bullet"/>
+      <w:lvlText w:val=""/>
+      <w:lvlJc w:val="left"/>
+      <w:pPr>
+        <w:tabs>
+          <w:tab w:val="num" w:pos="6480"/>
+        </w:tabs>
+        <w:ind w:left="6480" w:hanging="360"/>
+      </w:pPr>
+      <w:rPr>
+        <w:rFonts w:ascii="Wingdings" w:hAnsi="Wingdings" w:hint="default"/>
+        <w:sz w:val="20"/>
+      </w:rPr>
+    </w:lvl>
+  </w:abstractNum>
+  <w:abstractNum w:abstractNumId="5" w15:restartNumberingAfterBreak="0">
     <w:nsid w:val="1A945792"/>
     <w:multiLevelType w:val="multilevel"/>
     <w:tmpl w:val="AD728072"/>
@@ -1323,7 +2893,7 @@
       </w:rPr>
     </w:lvl>
   </w:abstractNum>
-  <w:abstractNum w:abstractNumId="3" w15:restartNumberingAfterBreak="0">
+  <w:abstractNum w:abstractNumId="6" w15:restartNumberingAfterBreak="0">
     <w:nsid w:val="1D144E2E"/>
     <w:multiLevelType w:val="multilevel"/>
     <w:tmpl w:val="07E8C3C0"/>
@@ -1472,7 +3042,7 @@
       </w:rPr>
     </w:lvl>
   </w:abstractNum>
-  <w:abstractNum w:abstractNumId="4" w15:restartNumberingAfterBreak="0">
+  <w:abstractNum w:abstractNumId="7" w15:restartNumberingAfterBreak="0">
     <w:nsid w:val="22415794"/>
     <w:multiLevelType w:val="multilevel"/>
     <w:tmpl w:val="37DA23D8"/>
@@ -1621,7 +3191,7 @@
       </w:rPr>
     </w:lvl>
   </w:abstractNum>
-  <w:abstractNum w:abstractNumId="5" w15:restartNumberingAfterBreak="0">
+  <w:abstractNum w:abstractNumId="8" w15:restartNumberingAfterBreak="0">
     <w:nsid w:val="24F61D43"/>
     <w:multiLevelType w:val="multilevel"/>
     <w:tmpl w:val="9F060FAE"/>
@@ -1770,7 +3340,7 @@
       </w:rPr>
     </w:lvl>
   </w:abstractNum>
-  <w:abstractNum w:abstractNumId="6" w15:restartNumberingAfterBreak="0">
+  <w:abstractNum w:abstractNumId="9" w15:restartNumberingAfterBreak="0">
     <w:nsid w:val="26106C50"/>
     <w:multiLevelType w:val="multilevel"/>
     <w:tmpl w:val="D9869F06"/>
@@ -1883,7 +3453,7 @@
       </w:pPr>
     </w:lvl>
   </w:abstractNum>
-  <w:abstractNum w:abstractNumId="7" w15:restartNumberingAfterBreak="0">
+  <w:abstractNum w:abstractNumId="10" w15:restartNumberingAfterBreak="0">
     <w:nsid w:val="29A14402"/>
     <w:multiLevelType w:val="multilevel"/>
     <w:tmpl w:val="9FD087D0"/>
@@ -2032,7 +3602,156 @@
       </w:rPr>
     </w:lvl>
   </w:abstractNum>
-  <w:abstractNum w:abstractNumId="8" w15:restartNumberingAfterBreak="0">
+  <w:abstractNum w:abstractNumId="11" w15:restartNumberingAfterBreak="0">
+    <w:nsid w:val="32F4778C"/>
+    <w:multiLevelType w:val="multilevel"/>
+    <w:tmpl w:val="2B2CA286"/>
+    <w:lvl w:ilvl="0">
+      <w:start w:val="1"/>
+      <w:numFmt w:val="bullet"/>
+      <w:lvlText w:val=""/>
+      <w:lvlJc w:val="left"/>
+      <w:pPr>
+        <w:tabs>
+          <w:tab w:val="num" w:pos="720"/>
+        </w:tabs>
+        <w:ind w:left="720" w:hanging="360"/>
+      </w:pPr>
+      <w:rPr>
+        <w:rFonts w:ascii="Symbol" w:hAnsi="Symbol" w:hint="default"/>
+        <w:sz w:val="20"/>
+      </w:rPr>
+    </w:lvl>
+    <w:lvl w:ilvl="1">
+      <w:start w:val="1"/>
+      <w:numFmt w:val="bullet"/>
+      <w:lvlText w:val="o"/>
+      <w:lvlJc w:val="left"/>
+      <w:pPr>
+        <w:tabs>
+          <w:tab w:val="num" w:pos="1440"/>
+        </w:tabs>
+        <w:ind w:left="1440" w:hanging="360"/>
+      </w:pPr>
+      <w:rPr>
+        <w:rFonts w:ascii="Courier New" w:hAnsi="Courier New" w:hint="default"/>
+        <w:sz w:val="20"/>
+      </w:rPr>
+    </w:lvl>
+    <w:lvl w:ilvl="2" w:tentative="1">
+      <w:start w:val="1"/>
+      <w:numFmt w:val="bullet"/>
+      <w:lvlText w:val=""/>
+      <w:lvlJc w:val="left"/>
+      <w:pPr>
+        <w:tabs>
+          <w:tab w:val="num" w:pos="2160"/>
+        </w:tabs>
+        <w:ind w:left="2160" w:hanging="360"/>
+      </w:pPr>
+      <w:rPr>
+        <w:rFonts w:ascii="Wingdings" w:hAnsi="Wingdings" w:hint="default"/>
+        <w:sz w:val="20"/>
+      </w:rPr>
+    </w:lvl>
+    <w:lvl w:ilvl="3" w:tentative="1">
+      <w:start w:val="1"/>
+      <w:numFmt w:val="bullet"/>
+      <w:lvlText w:val=""/>
+      <w:lvlJc w:val="left"/>
+      <w:pPr>
+        <w:tabs>
+          <w:tab w:val="num" w:pos="2880"/>
+        </w:tabs>
+        <w:ind w:left="2880" w:hanging="360"/>
+      </w:pPr>
+      <w:rPr>
+        <w:rFonts w:ascii="Wingdings" w:hAnsi="Wingdings" w:hint="default"/>
+        <w:sz w:val="20"/>
+      </w:rPr>
+    </w:lvl>
+    <w:lvl w:ilvl="4" w:tentative="1">
+      <w:start w:val="1"/>
+      <w:numFmt w:val="bullet"/>
+      <w:lvlText w:val=""/>
+      <w:lvlJc w:val="left"/>
+      <w:pPr>
+        <w:tabs>
+          <w:tab w:val="num" w:pos="3600"/>
+        </w:tabs>
+        <w:ind w:left="3600" w:hanging="360"/>
+      </w:pPr>
+      <w:rPr>
+        <w:rFonts w:ascii="Wingdings" w:hAnsi="Wingdings" w:hint="default"/>
+        <w:sz w:val="20"/>
+      </w:rPr>
+    </w:lvl>
+    <w:lvl w:ilvl="5" w:tentative="1">
+      <w:start w:val="1"/>
+      <w:numFmt w:val="bullet"/>
+      <w:lvlText w:val=""/>
+      <w:lvlJc w:val="left"/>
+      <w:pPr>
+        <w:tabs>
+          <w:tab w:val="num" w:pos="4320"/>
+        </w:tabs>
+        <w:ind w:left="4320" w:hanging="360"/>
+      </w:pPr>
+      <w:rPr>
+        <w:rFonts w:ascii="Wingdings" w:hAnsi="Wingdings" w:hint="default"/>
+        <w:sz w:val="20"/>
+      </w:rPr>
+    </w:lvl>
+    <w:lvl w:ilvl="6" w:tentative="1">
+      <w:start w:val="1"/>
+      <w:numFmt w:val="bullet"/>
+      <w:lvlText w:val=""/>
+      <w:lvlJc w:val="left"/>
+      <w:pPr>
+        <w:tabs>
+          <w:tab w:val="num" w:pos="5040"/>
+        </w:tabs>
+        <w:ind w:left="5040" w:hanging="360"/>
+      </w:pPr>
+      <w:rPr>
+        <w:rFonts w:ascii="Wingdings" w:hAnsi="Wingdings" w:hint="default"/>
+        <w:sz w:val="20"/>
+      </w:rPr>
+    </w:lvl>
+    <w:lvl w:ilvl="7" w:tentative="1">
+      <w:start w:val="1"/>
+      <w:numFmt w:val="bullet"/>
+      <w:lvlText w:val=""/>
+      <w:lvlJc w:val="left"/>
+      <w:pPr>
+        <w:tabs>
+          <w:tab w:val="num" w:pos="5760"/>
+        </w:tabs>
+        <w:ind w:left="5760" w:hanging="360"/>
+      </w:pPr>
+      <w:rPr>
+        <w:rFonts w:ascii="Wingdings" w:hAnsi="Wingdings" w:hint="default"/>
+        <w:sz w:val="20"/>
+      </w:rPr>
+    </w:lvl>
+    <w:lvl w:ilvl="8" w:tentative="1">
+      <w:start w:val="1"/>
+      <w:numFmt w:val="bullet"/>
+      <w:lvlText w:val=""/>
+      <w:lvlJc w:val="left"/>
+      <w:pPr>
+        <w:tabs>
+          <w:tab w:val="num" w:pos="6480"/>
+        </w:tabs>
+        <w:ind w:left="6480" w:hanging="360"/>
+      </w:pPr>
+      <w:rPr>
+        <w:rFonts w:ascii="Wingdings" w:hAnsi="Wingdings" w:hint="default"/>
+        <w:sz w:val="20"/>
+      </w:rPr>
+    </w:lvl>
+  </w:abstractNum>
+  <w:abstractNum w:abstractNumId="12" w15:restartNumberingAfterBreak="0">
     <w:nsid w:val="35A37ABC"/>
     <w:multiLevelType w:val="multilevel"/>
     <w:tmpl w:val="97B8EDA0"/>
@@ -2181,7 +3900,7 @@
       </w:rPr>
     </w:lvl>
   </w:abstractNum>
-  <w:abstractNum w:abstractNumId="9" w15:restartNumberingAfterBreak="0">
+  <w:abstractNum w:abstractNumId="13" w15:restartNumberingAfterBreak="0">
     <w:nsid w:val="36E40441"/>
     <w:multiLevelType w:val="multilevel"/>
     <w:tmpl w:val="DFECFE70"/>
@@ -2330,7 +4049,7 @@
       </w:rPr>
     </w:lvl>
   </w:abstractNum>
-  <w:abstractNum w:abstractNumId="10" w15:restartNumberingAfterBreak="0">
+  <w:abstractNum w:abstractNumId="14" w15:restartNumberingAfterBreak="0">
     <w:nsid w:val="384C78CB"/>
     <w:multiLevelType w:val="multilevel"/>
     <w:tmpl w:val="9BE65B8E"/>
@@ -2421,7 +4140,7 @@
       </w:pPr>
     </w:lvl>
   </w:abstractNum>
-  <w:abstractNum w:abstractNumId="11" w15:restartNumberingAfterBreak="0">
+  <w:abstractNum w:abstractNumId="15" w15:restartNumberingAfterBreak="0">
     <w:nsid w:val="3FCC3401"/>
     <w:multiLevelType w:val="multilevel"/>
     <w:tmpl w:val="A38CA230"/>
@@ -2570,7 +4289,7 @@
       </w:rPr>
     </w:lvl>
   </w:abstractNum>
-  <w:abstractNum w:abstractNumId="12" w15:restartNumberingAfterBreak="0">
+  <w:abstractNum w:abstractNumId="16" w15:restartNumberingAfterBreak="0">
     <w:nsid w:val="418719A0"/>
     <w:multiLevelType w:val="multilevel"/>
     <w:tmpl w:val="6BA654FC"/>
@@ -2719,7 +4438,7 @@
       </w:rPr>
     </w:lvl>
   </w:abstractNum>
-  <w:abstractNum w:abstractNumId="13" w15:restartNumberingAfterBreak="0">
+  <w:abstractNum w:abstractNumId="17" w15:restartNumberingAfterBreak="0">
     <w:nsid w:val="41BA488D"/>
     <w:multiLevelType w:val="multilevel"/>
     <w:tmpl w:val="4260AB64"/>
@@ -2805,7 +4524,7 @@
       </w:pPr>
     </w:lvl>
   </w:abstractNum>
-  <w:abstractNum w:abstractNumId="14" w15:restartNumberingAfterBreak="0">
+  <w:abstractNum w:abstractNumId="18" w15:restartNumberingAfterBreak="0">
     <w:nsid w:val="477C12B7"/>
     <w:multiLevelType w:val="multilevel"/>
     <w:tmpl w:val="4DE8128E"/>
@@ -2954,7 +4673,7 @@
       </w:rPr>
     </w:lvl>
   </w:abstractNum>
-  <w:abstractNum w:abstractNumId="15" w15:restartNumberingAfterBreak="0">
+  <w:abstractNum w:abstractNumId="19" w15:restartNumberingAfterBreak="0">
     <w:nsid w:val="497F5CE2"/>
     <w:multiLevelType w:val="multilevel"/>
     <w:tmpl w:val="40509256"/>
@@ -3103,7 +4822,120 @@
       </w:rPr>
     </w:lvl>
   </w:abstractNum>
-  <w:abstractNum w:abstractNumId="16" w15:restartNumberingAfterBreak="0">
+  <w:abstractNum w:abstractNumId="20" w15:restartNumberingAfterBreak="0">
+    <w:nsid w:val="4C9E0617"/>
+    <w:multiLevelType w:val="multilevel"/>
+    <w:tmpl w:val="81FAD3F2"/>
+    <w:lvl w:ilvl="0">
+      <w:start w:val="1"/>
+      <w:numFmt w:val="decimal"/>
+      <w:lvlText w:val="%1."/>
+      <w:lvlJc w:val="left"/>
+      <w:pPr>
+        <w:tabs>
+          <w:tab w:val="num" w:pos="720"/>
+        </w:tabs>
+        <w:ind w:left="720" w:hanging="360"/>
+      </w:pPr>
+    </w:lvl>
+    <w:lvl w:ilvl="1" w:tentative="1">
+      <w:start w:val="1"/>
+      <w:numFmt w:val="decimal"/>
+      <w:lvlText w:val="%2."/>
+      <w:lvlJc w:val="left"/>
+      <w:pPr>
+        <w:tabs>
+          <w:tab w:val="num" w:pos="1440"/>
+        </w:tabs>
+        <w:ind w:left="1440" w:hanging="360"/>
+      </w:pPr>
+    </w:lvl>
+    <w:lvl w:ilvl="2" w:tentative="1">
+      <w:start w:val="1"/>
+      <w:numFmt w:val="decimal"/>
+      <w:lvlText w:val="%3."/>
+      <w:lvlJc w:val="left"/>
+      <w:pPr>
+        <w:tabs>
+          <w:tab w:val="num" w:pos="2160"/>
+        </w:tabs>
+        <w:ind w:left="2160" w:hanging="360"/>
+      </w:pPr>
+    </w:lvl>
+    <w:lvl w:ilvl="3" w:tentative="1">
+      <w:start w:val="1"/>
+      <w:numFmt w:val="decimal"/>
+      <w:lvlText w:val="%4."/>
+      <w:lvlJc w:val="left"/>
+      <w:pPr>
+        <w:tabs>
+          <w:tab w:val="num" w:pos="2880"/>
+        </w:tabs>
+        <w:ind w:left="2880" w:hanging="360"/>
+      </w:pPr>
+    </w:lvl>
+    <w:lvl w:ilvl="4" w:tentative="1">
+      <w:start w:val="1"/>
+      <w:numFmt w:val="decimal"/>
+      <w:lvlText w:val="%5."/>
+      <w:lvlJc w:val="left"/>
+      <w:pPr>
+        <w:tabs>
+          <w:tab w:val="num" w:pos="3600"/>
+        </w:tabs>
+        <w:ind w:left="3600" w:hanging="360"/>
+      </w:pPr>
+    </w:lvl>
+    <w:lvl w:ilvl="5" w:tentative="1">
+      <w:start w:val="1"/>
+      <w:numFmt w:val="decimal"/>
+      <w:lvlText w:val="%6."/>
+      <w:lvlJc w:val="left"/>
+      <w:pPr>
+        <w:tabs>
+          <w:tab w:val="num" w:pos="4320"/>
+        </w:tabs>
+        <w:ind w:left="4320" w:hanging="360"/>
+      </w:pPr>
+    </w:lvl>
+    <w:lvl w:ilvl="6" w:tentative="1">
+      <w:start w:val="1"/>
+      <w:numFmt w:val="decimal"/>
+      <w:lvlText w:val="%7."/>
+      <w:lvlJc w:val="left"/>
+      <w:pPr>
+        <w:tabs>
+          <w:tab w:val="num" w:pos="5040"/>
+        </w:tabs>
+        <w:ind w:left="5040" w:hanging="360"/>
+      </w:pPr>
+    </w:lvl>
+    <w:lvl w:ilvl="7" w:tentative="1">
+      <w:start w:val="1"/>
+      <w:numFmt w:val="decimal"/>
+      <w:lvlText w:val="%8."/>
+      <w:lvlJc w:val="left"/>
+      <w:pPr>
+        <w:tabs>
+          <w:tab w:val="num" w:pos="5760"/>
+        </w:tabs>
+        <w:ind w:left="5760" w:hanging="360"/>
+      </w:pPr>
+    </w:lvl>
+    <w:lvl w:ilvl="8" w:tentative="1">
+      <w:start w:val="1"/>
+      <w:numFmt w:val="decimal"/>
+      <w:lvlText w:val="%9."/>
+      <w:lvlJc w:val="left"/>
+      <w:pPr>
+        <w:tabs>
+          <w:tab w:val="num" w:pos="6480"/>
+        </w:tabs>
+        <w:ind w:left="6480" w:hanging="360"/>
+      </w:pPr>
+    </w:lvl>
+  </w:abstractNum>
+  <w:abstractNum w:abstractNumId="21" w15:restartNumberingAfterBreak="0">
     <w:nsid w:val="590D04A1"/>
     <w:multiLevelType w:val="multilevel"/>
     <w:tmpl w:val="AB58D736"/>
@@ -3252,7 +5084,7 @@
       </w:rPr>
     </w:lvl>
   </w:abstractNum>
-  <w:abstractNum w:abstractNumId="17" w15:restartNumberingAfterBreak="0">
+  <w:abstractNum w:abstractNumId="22" w15:restartNumberingAfterBreak="0">
     <w:nsid w:val="5FB1635F"/>
     <w:multiLevelType w:val="hybridMultilevel"/>
     <w:tmpl w:val="F8EC2D82"/>
@@ -3341,7 +5173,7 @@
       </w:pPr>
     </w:lvl>
   </w:abstractNum>
-  <w:abstractNum w:abstractNumId="18" w15:restartNumberingAfterBreak="0">
+  <w:abstractNum w:abstractNumId="23" w15:restartNumberingAfterBreak="0">
     <w:nsid w:val="612A4A5F"/>
     <w:multiLevelType w:val="multilevel"/>
     <w:tmpl w:val="AE4632BA"/>
@@ -3490,7 +5322,7 @@
       </w:rPr>
     </w:lvl>
   </w:abstractNum>
-  <w:abstractNum w:abstractNumId="19" w15:restartNumberingAfterBreak="0">
+  <w:abstractNum w:abstractNumId="24" w15:restartNumberingAfterBreak="0">
     <w:nsid w:val="66AB731F"/>
     <w:multiLevelType w:val="multilevel"/>
     <w:tmpl w:val="9B300244"/>
@@ -3639,7 +5471,7 @@
       </w:rPr>
     </w:lvl>
   </w:abstractNum>
-  <w:abstractNum w:abstractNumId="20" w15:restartNumberingAfterBreak="0">
+  <w:abstractNum w:abstractNumId="25" w15:restartNumberingAfterBreak="0">
     <w:nsid w:val="66AC109E"/>
     <w:multiLevelType w:val="multilevel"/>
     <w:tmpl w:val="7CD80FD0"/>
@@ -3788,110 +5620,581 @@
       </w:rPr>
     </w:lvl>
   </w:abstractNum>
+  <w:abstractNum w:abstractNumId="26" w15:restartNumberingAfterBreak="0">
+    <w:nsid w:val="66C44178"/>
+    <w:multiLevelType w:val="multilevel"/>
+    <w:tmpl w:val="CBE6ABA6"/>
+    <w:lvl w:ilvl="0">
+      <w:start w:val="1"/>
+      <w:numFmt w:val="bullet"/>
+      <w:lvlText w:val=""/>
+      <w:lvlJc w:val="left"/>
+      <w:pPr>
+        <w:tabs>
+          <w:tab w:val="num" w:pos="720"/>
+        </w:tabs>
+        <w:ind w:left="720" w:hanging="360"/>
+      </w:pPr>
+      <w:rPr>
+        <w:rFonts w:ascii="Symbol" w:hAnsi="Symbol" w:hint="default"/>
+        <w:sz w:val="20"/>
+      </w:rPr>
+    </w:lvl>
+    <w:lvl w:ilvl="1" w:tentative="1">
+      <w:start w:val="1"/>
+      <w:numFmt w:val="bullet"/>
+      <w:lvlText w:val="o"/>
+      <w:lvlJc w:val="left"/>
+      <w:pPr>
+        <w:tabs>
+          <w:tab w:val="num" w:pos="1440"/>
+        </w:tabs>
+        <w:ind w:left="1440" w:hanging="360"/>
+      </w:pPr>
+      <w:rPr>
+        <w:rFonts w:ascii="Courier New" w:hAnsi="Courier New" w:hint="default"/>
+        <w:sz w:val="20"/>
+      </w:rPr>
+    </w:lvl>
+    <w:lvl w:ilvl="2" w:tentative="1">
+      <w:start w:val="1"/>
+      <w:numFmt w:val="bullet"/>
+      <w:lvlText w:val=""/>
+      <w:lvlJc w:val="left"/>
+      <w:pPr>
+        <w:tabs>
+          <w:tab w:val="num" w:pos="2160"/>
+        </w:tabs>
+        <w:ind w:left="2160" w:hanging="360"/>
+      </w:pPr>
+      <w:rPr>
+        <w:rFonts w:ascii="Wingdings" w:hAnsi="Wingdings" w:hint="default"/>
+        <w:sz w:val="20"/>
+      </w:rPr>
+    </w:lvl>
+    <w:lvl w:ilvl="3" w:tentative="1">
+      <w:start w:val="1"/>
+      <w:numFmt w:val="bullet"/>
+      <w:lvlText w:val=""/>
+      <w:lvlJc w:val="left"/>
+      <w:pPr>
+        <w:tabs>
+          <w:tab w:val="num" w:pos="2880"/>
+        </w:tabs>
+        <w:ind w:left="2880" w:hanging="360"/>
+      </w:pPr>
+      <w:rPr>
+        <w:rFonts w:ascii="Wingdings" w:hAnsi="Wingdings" w:hint="default"/>
+        <w:sz w:val="20"/>
+      </w:rPr>
+    </w:lvl>
+    <w:lvl w:ilvl="4" w:tentative="1">
+      <w:start w:val="1"/>
+      <w:numFmt w:val="bullet"/>
+      <w:lvlText w:val=""/>
+      <w:lvlJc w:val="left"/>
+      <w:pPr>
+        <w:tabs>
+          <w:tab w:val="num" w:pos="3600"/>
+        </w:tabs>
+        <w:ind w:left="3600" w:hanging="360"/>
+      </w:pPr>
+      <w:rPr>
+        <w:rFonts w:ascii="Wingdings" w:hAnsi="Wingdings" w:hint="default"/>
+        <w:sz w:val="20"/>
+      </w:rPr>
+    </w:lvl>
+    <w:lvl w:ilvl="5" w:tentative="1">
+      <w:start w:val="1"/>
+      <w:numFmt w:val="bullet"/>
+      <w:lvlText w:val=""/>
+      <w:lvlJc w:val="left"/>
+      <w:pPr>
+        <w:tabs>
+          <w:tab w:val="num" w:pos="4320"/>
+        </w:tabs>
+        <w:ind w:left="4320" w:hanging="360"/>
+      </w:pPr>
+      <w:rPr>
+        <w:rFonts w:ascii="Wingdings" w:hAnsi="Wingdings" w:hint="default"/>
+        <w:sz w:val="20"/>
+      </w:rPr>
+    </w:lvl>
+    <w:lvl w:ilvl="6" w:tentative="1">
+      <w:start w:val="1"/>
+      <w:numFmt w:val="bullet"/>
+      <w:lvlText w:val=""/>
+      <w:lvlJc w:val="left"/>
+      <w:pPr>
+        <w:tabs>
+          <w:tab w:val="num" w:pos="5040"/>
+        </w:tabs>
+        <w:ind w:left="5040" w:hanging="360"/>
+      </w:pPr>
+      <w:rPr>
+        <w:rFonts w:ascii="Wingdings" w:hAnsi="Wingdings" w:hint="default"/>
+        <w:sz w:val="20"/>
+      </w:rPr>
+    </w:lvl>
+    <w:lvl w:ilvl="7" w:tentative="1">
+      <w:start w:val="1"/>
+      <w:numFmt w:val="bullet"/>
+      <w:lvlText w:val=""/>
+      <w:lvlJc w:val="left"/>
+      <w:pPr>
+        <w:tabs>
+          <w:tab w:val="num" w:pos="5760"/>
+        </w:tabs>
+        <w:ind w:left="5760" w:hanging="360"/>
+      </w:pPr>
+      <w:rPr>
+        <w:rFonts w:ascii="Wingdings" w:hAnsi="Wingdings" w:hint="default"/>
+        <w:sz w:val="20"/>
+      </w:rPr>
+    </w:lvl>
+    <w:lvl w:ilvl="8" w:tentative="1">
+      <w:start w:val="1"/>
+      <w:numFmt w:val="bullet"/>
+      <w:lvlText w:val=""/>
+      <w:lvlJc w:val="left"/>
+      <w:pPr>
+        <w:tabs>
+          <w:tab w:val="num" w:pos="6480"/>
+        </w:tabs>
+        <w:ind w:left="6480" w:hanging="360"/>
+      </w:pPr>
+      <w:rPr>
+        <w:rFonts w:ascii="Wingdings" w:hAnsi="Wingdings" w:hint="default"/>
+        <w:sz w:val="20"/>
+      </w:rPr>
+    </w:lvl>
+  </w:abstractNum>
+  <w:abstractNum w:abstractNumId="27" w15:restartNumberingAfterBreak="0">
+    <w:nsid w:val="6CBC404F"/>
+    <w:multiLevelType w:val="multilevel"/>
+    <w:tmpl w:val="B0727E90"/>
+    <w:lvl w:ilvl="0">
+      <w:start w:val="1"/>
+      <w:numFmt w:val="bullet"/>
+      <w:lvlText w:val=""/>
+      <w:lvlJc w:val="left"/>
+      <w:pPr>
+        <w:tabs>
+          <w:tab w:val="num" w:pos="720"/>
+        </w:tabs>
+        <w:ind w:left="720" w:hanging="360"/>
+      </w:pPr>
+      <w:rPr>
+        <w:rFonts w:ascii="Symbol" w:hAnsi="Symbol" w:hint="default"/>
+        <w:sz w:val="20"/>
+      </w:rPr>
+    </w:lvl>
+    <w:lvl w:ilvl="1" w:tentative="1">
+      <w:start w:val="1"/>
+      <w:numFmt w:val="bullet"/>
+      <w:lvlText w:val="o"/>
+      <w:lvlJc w:val="left"/>
+      <w:pPr>
+        <w:tabs>
+          <w:tab w:val="num" w:pos="1440"/>
+        </w:tabs>
+        <w:ind w:left="1440" w:hanging="360"/>
+      </w:pPr>
+      <w:rPr>
+        <w:rFonts w:ascii="Courier New" w:hAnsi="Courier New" w:hint="default"/>
+        <w:sz w:val="20"/>
+      </w:rPr>
+    </w:lvl>
+    <w:lvl w:ilvl="2" w:tentative="1">
+      <w:start w:val="1"/>
+      <w:numFmt w:val="bullet"/>
+      <w:lvlText w:val=""/>
+      <w:lvlJc w:val="left"/>
+      <w:pPr>
+        <w:tabs>
+          <w:tab w:val="num" w:pos="2160"/>
+        </w:tabs>
+        <w:ind w:left="2160" w:hanging="360"/>
+      </w:pPr>
+      <w:rPr>
+        <w:rFonts w:ascii="Wingdings" w:hAnsi="Wingdings" w:hint="default"/>
+        <w:sz w:val="20"/>
+      </w:rPr>
+    </w:lvl>
+    <w:lvl w:ilvl="3" w:tentative="1">
+      <w:start w:val="1"/>
+      <w:numFmt w:val="bullet"/>
+      <w:lvlText w:val=""/>
+      <w:lvlJc w:val="left"/>
+      <w:pPr>
+        <w:tabs>
+          <w:tab w:val="num" w:pos="2880"/>
+        </w:tabs>
+        <w:ind w:left="2880" w:hanging="360"/>
+      </w:pPr>
+      <w:rPr>
+        <w:rFonts w:ascii="Wingdings" w:hAnsi="Wingdings" w:hint="default"/>
+        <w:sz w:val="20"/>
+      </w:rPr>
+    </w:lvl>
+    <w:lvl w:ilvl="4" w:tentative="1">
+      <w:start w:val="1"/>
+      <w:numFmt w:val="bullet"/>
+      <w:lvlText w:val=""/>
+      <w:lvlJc w:val="left"/>
+      <w:pPr>
+        <w:tabs>
+          <w:tab w:val="num" w:pos="3600"/>
+        </w:tabs>
+        <w:ind w:left="3600" w:hanging="360"/>
+      </w:pPr>
+      <w:rPr>
+        <w:rFonts w:ascii="Wingdings" w:hAnsi="Wingdings" w:hint="default"/>
+        <w:sz w:val="20"/>
+      </w:rPr>
+    </w:lvl>
+    <w:lvl w:ilvl="5" w:tentative="1">
+      <w:start w:val="1"/>
+      <w:numFmt w:val="bullet"/>
+      <w:lvlText w:val=""/>
+      <w:lvlJc w:val="left"/>
+      <w:pPr>
+        <w:tabs>
+          <w:tab w:val="num" w:pos="4320"/>
+        </w:tabs>
+        <w:ind w:left="4320" w:hanging="360"/>
+      </w:pPr>
+      <w:rPr>
+        <w:rFonts w:ascii="Wingdings" w:hAnsi="Wingdings" w:hint="default"/>
+        <w:sz w:val="20"/>
+      </w:rPr>
+    </w:lvl>
+    <w:lvl w:ilvl="6" w:tentative="1">
+      <w:start w:val="1"/>
+      <w:numFmt w:val="bullet"/>
+      <w:lvlText w:val=""/>
+      <w:lvlJc w:val="left"/>
+      <w:pPr>
+        <w:tabs>
+          <w:tab w:val="num" w:pos="5040"/>
+        </w:tabs>
+        <w:ind w:left="5040" w:hanging="360"/>
+      </w:pPr>
+      <w:rPr>
+        <w:rFonts w:ascii="Wingdings" w:hAnsi="Wingdings" w:hint="default"/>
+        <w:sz w:val="20"/>
+      </w:rPr>
+    </w:lvl>
+    <w:lvl w:ilvl="7" w:tentative="1">
+      <w:start w:val="1"/>
+      <w:numFmt w:val="bullet"/>
+      <w:lvlText w:val=""/>
+      <w:lvlJc w:val="left"/>
+      <w:pPr>
+        <w:tabs>
+          <w:tab w:val="num" w:pos="5760"/>
+        </w:tabs>
+        <w:ind w:left="5760" w:hanging="360"/>
+      </w:pPr>
+      <w:rPr>
+        <w:rFonts w:ascii="Wingdings" w:hAnsi="Wingdings" w:hint="default"/>
+        <w:sz w:val="20"/>
+      </w:rPr>
+    </w:lvl>
+    <w:lvl w:ilvl="8" w:tentative="1">
+      <w:start w:val="1"/>
+      <w:numFmt w:val="bullet"/>
+      <w:lvlText w:val=""/>
+      <w:lvlJc w:val="left"/>
+      <w:pPr>
+        <w:tabs>
+          <w:tab w:val="num" w:pos="6480"/>
+        </w:tabs>
+        <w:ind w:left="6480" w:hanging="360"/>
+      </w:pPr>
+      <w:rPr>
+        <w:rFonts w:ascii="Wingdings" w:hAnsi="Wingdings" w:hint="default"/>
+        <w:sz w:val="20"/>
+      </w:rPr>
+    </w:lvl>
+  </w:abstractNum>
+  <w:abstractNum w:abstractNumId="28" w15:restartNumberingAfterBreak="0">
+    <w:nsid w:val="7B5842E2"/>
+    <w:multiLevelType w:val="multilevel"/>
+    <w:tmpl w:val="5A2A6492"/>
+    <w:lvl w:ilvl="0">
+      <w:start w:val="1"/>
+      <w:numFmt w:val="bullet"/>
+      <w:lvlText w:val=""/>
+      <w:lvlJc w:val="left"/>
+      <w:pPr>
+        <w:tabs>
+          <w:tab w:val="num" w:pos="720"/>
+        </w:tabs>
+        <w:ind w:left="720" w:hanging="360"/>
+      </w:pPr>
+      <w:rPr>
+        <w:rFonts w:ascii="Symbol" w:hAnsi="Symbol" w:hint="default"/>
+        <w:sz w:val="20"/>
+      </w:rPr>
+    </w:lvl>
+    <w:lvl w:ilvl="1" w:tentative="1">
+      <w:start w:val="1"/>
+      <w:numFmt w:val="bullet"/>
+      <w:lvlText w:val="o"/>
+      <w:lvlJc w:val="left"/>
+      <w:pPr>
+        <w:tabs>
+          <w:tab w:val="num" w:pos="1440"/>
+        </w:tabs>
+        <w:ind w:left="1440" w:hanging="360"/>
+      </w:pPr>
+      <w:rPr>
+        <w:rFonts w:ascii="Courier New" w:hAnsi="Courier New" w:hint="default"/>
+        <w:sz w:val="20"/>
+      </w:rPr>
+    </w:lvl>
+    <w:lvl w:ilvl="2" w:tentative="1">
+      <w:start w:val="1"/>
+      <w:numFmt w:val="bullet"/>
+      <w:lvlText w:val=""/>
+      <w:lvlJc w:val="left"/>
+      <w:pPr>
+        <w:tabs>
+          <w:tab w:val="num" w:pos="2160"/>
+        </w:tabs>
+        <w:ind w:left="2160" w:hanging="360"/>
+      </w:pPr>
+      <w:rPr>
+        <w:rFonts w:ascii="Wingdings" w:hAnsi="Wingdings" w:hint="default"/>
+        <w:sz w:val="20"/>
+      </w:rPr>
+    </w:lvl>
+    <w:lvl w:ilvl="3" w:tentative="1">
+      <w:start w:val="1"/>
+      <w:numFmt w:val="bullet"/>
+      <w:lvlText w:val=""/>
+      <w:lvlJc w:val="left"/>
+      <w:pPr>
+        <w:tabs>
+          <w:tab w:val="num" w:pos="2880"/>
+        </w:tabs>
+        <w:ind w:left="2880" w:hanging="360"/>
+      </w:pPr>
+      <w:rPr>
+        <w:rFonts w:ascii="Wingdings" w:hAnsi="Wingdings" w:hint="default"/>
+        <w:sz w:val="20"/>
+      </w:rPr>
+    </w:lvl>
+    <w:lvl w:ilvl="4" w:tentative="1">
+      <w:start w:val="1"/>
+      <w:numFmt w:val="bullet"/>
+      <w:lvlText w:val=""/>
+      <w:lvlJc w:val="left"/>
+      <w:pPr>
+        <w:tabs>
+          <w:tab w:val="num" w:pos="3600"/>
+        </w:tabs>
+        <w:ind w:left="3600" w:hanging="360"/>
+      </w:pPr>
+      <w:rPr>
+        <w:rFonts w:ascii="Wingdings" w:hAnsi="Wingdings" w:hint="default"/>
+        <w:sz w:val="20"/>
+      </w:rPr>
+    </w:lvl>
+    <w:lvl w:ilvl="5" w:tentative="1">
+      <w:start w:val="1"/>
+      <w:numFmt w:val="bullet"/>
+      <w:lvlText w:val=""/>
+      <w:lvlJc w:val="left"/>
+      <w:pPr>
+        <w:tabs>
+          <w:tab w:val="num" w:pos="4320"/>
+        </w:tabs>
+        <w:ind w:left="4320" w:hanging="360"/>
+      </w:pPr>
+      <w:rPr>
+        <w:rFonts w:ascii="Wingdings" w:hAnsi="Wingdings" w:hint="default"/>
+        <w:sz w:val="20"/>
+      </w:rPr>
+    </w:lvl>
+    <w:lvl w:ilvl="6" w:tentative="1">
+      <w:start w:val="1"/>
+      <w:numFmt w:val="bullet"/>
+      <w:lvlText w:val=""/>
+      <w:lvlJc w:val="left"/>
+      <w:pPr>
+        <w:tabs>
+          <w:tab w:val="num" w:pos="5040"/>
+        </w:tabs>
+        <w:ind w:left="5040" w:hanging="360"/>
+      </w:pPr>
+      <w:rPr>
+        <w:rFonts w:ascii="Wingdings" w:hAnsi="Wingdings" w:hint="default"/>
+        <w:sz w:val="20"/>
+      </w:rPr>
+    </w:lvl>
+    <w:lvl w:ilvl="7" w:tentative="1">
+      <w:start w:val="1"/>
+      <w:numFmt w:val="bullet"/>
+      <w:lvlText w:val=""/>
+      <w:lvlJc w:val="left"/>
+      <w:pPr>
+        <w:tabs>
+          <w:tab w:val="num" w:pos="5760"/>
+        </w:tabs>
+        <w:ind w:left="5760" w:hanging="360"/>
+      </w:pPr>
+      <w:rPr>
+        <w:rFonts w:ascii="Wingdings" w:hAnsi="Wingdings" w:hint="default"/>
+        <w:sz w:val="20"/>
+      </w:rPr>
+    </w:lvl>
+    <w:lvl w:ilvl="8" w:tentative="1">
+      <w:start w:val="1"/>
+      <w:numFmt w:val="bullet"/>
+      <w:lvlText w:val=""/>
+      <w:lvlJc w:val="left"/>
+      <w:pPr>
+        <w:tabs>
+          <w:tab w:val="num" w:pos="6480"/>
+        </w:tabs>
+        <w:ind w:left="6480" w:hanging="360"/>
+      </w:pPr>
+      <w:rPr>
+        <w:rFonts w:ascii="Wingdings" w:hAnsi="Wingdings" w:hint="default"/>
+        <w:sz w:val="20"/>
+      </w:rPr>
+    </w:lvl>
+  </w:abstractNum>
   <w:num w:numId="1" w16cid:durableId="2057659798">
+    <w:abstractNumId w:val="14"/>
+  </w:num>
+  <w:num w:numId="2" w16cid:durableId="99107261">
+    <w:abstractNumId w:val="14"/>
+  </w:num>
+  <w:num w:numId="3" w16cid:durableId="454829576">
+    <w:abstractNumId w:val="14"/>
+  </w:num>
+  <w:num w:numId="4" w16cid:durableId="919875635">
+    <w:abstractNumId w:val="14"/>
+  </w:num>
+  <w:num w:numId="5" w16cid:durableId="1989245865">
+    <w:abstractNumId w:val="14"/>
+  </w:num>
+  <w:num w:numId="6" w16cid:durableId="337856889">
+    <w:abstractNumId w:val="14"/>
+  </w:num>
+  <w:num w:numId="7" w16cid:durableId="486750497">
+    <w:abstractNumId w:val="9"/>
+  </w:num>
+  <w:num w:numId="8" w16cid:durableId="1295481688">
+    <w:abstractNumId w:val="14"/>
+  </w:num>
+  <w:num w:numId="9" w16cid:durableId="878207473">
+    <w:abstractNumId w:val="14"/>
+  </w:num>
+  <w:num w:numId="10" w16cid:durableId="390271873">
+    <w:abstractNumId w:val="9"/>
+  </w:num>
+  <w:num w:numId="11" w16cid:durableId="108548336">
+    <w:abstractNumId w:val="14"/>
+  </w:num>
+  <w:num w:numId="12" w16cid:durableId="289626826">
+    <w:abstractNumId w:val="17"/>
+  </w:num>
+  <w:num w:numId="13" w16cid:durableId="709189428">
+    <w:abstractNumId w:val="22"/>
+  </w:num>
+  <w:num w:numId="14" w16cid:durableId="1828012820">
+    <w:abstractNumId w:val="14"/>
+  </w:num>
+  <w:num w:numId="15" w16cid:durableId="1472016058">
+    <w:abstractNumId w:val="14"/>
+  </w:num>
+  <w:num w:numId="16" w16cid:durableId="2007130954">
+    <w:abstractNumId w:val="14"/>
+  </w:num>
+  <w:num w:numId="17" w16cid:durableId="2124959910">
+    <w:abstractNumId w:val="14"/>
+  </w:num>
+  <w:num w:numId="18" w16cid:durableId="1161965983">
+    <w:abstractNumId w:val="14"/>
+  </w:num>
+  <w:num w:numId="19" w16cid:durableId="1233462527">
+    <w:abstractNumId w:val="7"/>
+  </w:num>
+  <w:num w:numId="20" w16cid:durableId="1754618737">
+    <w:abstractNumId w:val="1"/>
+  </w:num>
+  <w:num w:numId="21" w16cid:durableId="1726293185">
+    <w:abstractNumId w:val="16"/>
+  </w:num>
+  <w:num w:numId="22" w16cid:durableId="1811291165">
+    <w:abstractNumId w:val="12"/>
+  </w:num>
+  <w:num w:numId="23" w16cid:durableId="941496760">
+    <w:abstractNumId w:val="19"/>
+  </w:num>
+  <w:num w:numId="24" w16cid:durableId="1585459660">
+    <w:abstractNumId w:val="21"/>
+  </w:num>
+  <w:num w:numId="25" w16cid:durableId="335889668">
+    <w:abstractNumId w:val="5"/>
+  </w:num>
+  <w:num w:numId="26" w16cid:durableId="1999456181">
+    <w:abstractNumId w:val="25"/>
+  </w:num>
+  <w:num w:numId="27" w16cid:durableId="306784731">
+    <w:abstractNumId w:val="6"/>
+  </w:num>
+  <w:num w:numId="28" w16cid:durableId="1129084397">
+    <w:abstractNumId w:val="15"/>
+  </w:num>
+  <w:num w:numId="29" w16cid:durableId="550112270">
+    <w:abstractNumId w:val="24"/>
+  </w:num>
+  <w:num w:numId="30" w16cid:durableId="1820343538">
     <w:abstractNumId w:val="10"/>
   </w:num>
-  <w:num w:numId="2" w16cid:durableId="99107261">
-    <w:abstractNumId w:val="10"/>
+  <w:num w:numId="31" w16cid:durableId="581447850">
+    <w:abstractNumId w:val="18"/>
   </w:num>
-  <w:num w:numId="3" w16cid:durableId="454829576">
-    <w:abstractNumId w:val="10"/>
-  </w:num>
-  <w:num w:numId="4" w16cid:durableId="919875635">
-    <w:abstractNumId w:val="10"/>
-  </w:num>
-  <w:num w:numId="5" w16cid:durableId="1989245865">
-    <w:abstractNumId w:val="10"/>
-  </w:num>
-  <w:num w:numId="6" w16cid:durableId="337856889">
-    <w:abstractNumId w:val="10"/>
-  </w:num>
-  <w:num w:numId="7" w16cid:durableId="486750497">
-    <w:abstractNumId w:val="6"/>
-  </w:num>
-  <w:num w:numId="8" w16cid:durableId="1295481688">
-    <w:abstractNumId w:val="10"/>
-  </w:num>
-  <w:num w:numId="9" w16cid:durableId="878207473">
-    <w:abstractNumId w:val="10"/>
-  </w:num>
-  <w:num w:numId="10" w16cid:durableId="390271873">
-    <w:abstractNumId w:val="6"/>
-  </w:num>
-  <w:num w:numId="11" w16cid:durableId="108548336">
-    <w:abstractNumId w:val="10"/>
-  </w:num>
-  <w:num w:numId="12" w16cid:durableId="289626826">
+  <w:num w:numId="32" w16cid:durableId="1663659179">
     <w:abstractNumId w:val="13"/>
   </w:num>
-  <w:num w:numId="13" w16cid:durableId="709189428">
-    <w:abstractNumId w:val="17"/>
+  <w:num w:numId="33" w16cid:durableId="1859462536">
+    <w:abstractNumId w:val="8"/>
   </w:num>
-  <w:num w:numId="14" w16cid:durableId="1828012820">
-    <w:abstractNumId w:val="10"/>
+  <w:num w:numId="34" w16cid:durableId="1843619595">
+    <w:abstractNumId w:val="2"/>
   </w:num>
-  <w:num w:numId="15" w16cid:durableId="1472016058">
-    <w:abstractNumId w:val="10"/>
+  <w:num w:numId="35" w16cid:durableId="666518436">
+    <w:abstractNumId w:val="23"/>
   </w:num>
-  <w:num w:numId="16" w16cid:durableId="2007130954">
-    <w:abstractNumId w:val="10"/>
+  <w:num w:numId="36" w16cid:durableId="1711224988">
+    <w:abstractNumId w:val="27"/>
   </w:num>
-  <w:num w:numId="17" w16cid:durableId="2124959910">
-    <w:abstractNumId w:val="10"/>
+  <w:num w:numId="37" w16cid:durableId="1141771187">
+    <w:abstractNumId w:val="26"/>
   </w:num>
-  <w:num w:numId="18" w16cid:durableId="1161965983">
-    <w:abstractNumId w:val="10"/>
+  <w:num w:numId="38" w16cid:durableId="1424763422">
+    <w:abstractNumId w:val="0"/>
   </w:num>
-  <w:num w:numId="19" w16cid:durableId="1233462527">
+  <w:num w:numId="39" w16cid:durableId="1217469925">
+    <w:abstractNumId w:val="28"/>
+  </w:num>
+  <w:num w:numId="40" w16cid:durableId="154414915">
     <w:abstractNumId w:val="4"/>
   </w:num>
-  <w:num w:numId="20" w16cid:durableId="1754618737">
-    <w:abstractNumId w:val="0"/>
-  </w:num>
-  <w:num w:numId="21" w16cid:durableId="1726293185">
-    <w:abstractNumId w:val="12"/>
-  </w:num>
-  <w:num w:numId="22" w16cid:durableId="1811291165">
-    <w:abstractNumId w:val="8"/>
-  </w:num>
-  <w:num w:numId="23" w16cid:durableId="941496760">
-    <w:abstractNumId w:val="15"/>
-  </w:num>
-  <w:num w:numId="24" w16cid:durableId="1585459660">
-    <w:abstractNumId w:val="16"/>
-  </w:num>
-  <w:num w:numId="25" w16cid:durableId="335889668">
-    <w:abstractNumId w:val="2"/>
-  </w:num>
-  <w:num w:numId="26" w16cid:durableId="1999456181">
+  <w:num w:numId="41" w16cid:durableId="1242445434">
     <w:abstractNumId w:val="20"/>
   </w:num>
-  <w:num w:numId="27" w16cid:durableId="306784731">
+  <w:num w:numId="42" w16cid:durableId="1275866219">
     <w:abstractNumId w:val="3"/>
   </w:num>
-  <w:num w:numId="28" w16cid:durableId="1129084397">
+  <w:num w:numId="43" w16cid:durableId="1072655325">
     <w:abstractNumId w:val="11"/>
-  </w:num>
-  <w:num w:numId="29" w16cid:durableId="550112270">
-    <w:abstractNumId w:val="19"/>
-  </w:num>
-  <w:num w:numId="30" w16cid:durableId="1820343538">
-    <w:abstractNumId w:val="7"/>
-  </w:num>
-  <w:num w:numId="31" w16cid:durableId="581447850">
-    <w:abstractNumId w:val="14"/>
-  </w:num>
-  <w:num w:numId="32" w16cid:durableId="1663659179">
-    <w:abstractNumId w:val="9"/>
-  </w:num>
-  <w:num w:numId="33" w16cid:durableId="1859462536">
-    <w:abstractNumId w:val="5"/>
-  </w:num>
-  <w:num w:numId="34" w16cid:durableId="1843619595">
-    <w:abstractNumId w:val="1"/>
-  </w:num>
-  <w:num w:numId="35" w16cid:durableId="666518436">
-    <w:abstractNumId w:val="18"/>
   </w:num>
 </w:numbering>
 </file>
@@ -4985,6 +7288,73 @@
       <w:bCs/>
     </w:rPr>
   </w:style>
+  <w:style w:type="paragraph" w:styleId="HTMLPreformatted">
+    <w:name w:val="HTML Preformatted"/>
+    <w:basedOn w:val="Normal"/>
+    <w:link w:val="HTMLPreformattedChar"/>
+    <w:uiPriority w:val="99"/>
+    <w:semiHidden/>
+    <w:unhideWhenUsed/>
+    <w:rsid w:val="008822BF"/>
+    <w:pPr>
+      <w:tabs>
+        <w:tab w:val="left" w:pos="916"/>
+        <w:tab w:val="left" w:pos="1832"/>
+        <w:tab w:val="left" w:pos="2748"/>
+        <w:tab w:val="left" w:pos="3664"/>
+        <w:tab w:val="left" w:pos="4580"/>
+        <w:tab w:val="left" w:pos="5496"/>
+        <w:tab w:val="left" w:pos="6412"/>
+        <w:tab w:val="left" w:pos="7328"/>
+        <w:tab w:val="left" w:pos="8244"/>
+        <w:tab w:val="left" w:pos="9160"/>
+        <w:tab w:val="left" w:pos="10076"/>
+        <w:tab w:val="left" w:pos="10992"/>
+        <w:tab w:val="left" w:pos="11908"/>
+        <w:tab w:val="left" w:pos="12824"/>
+        <w:tab w:val="left" w:pos="13740"/>
+        <w:tab w:val="left" w:pos="14656"/>
+      </w:tabs>
+      <w:spacing w:after="0" w:line="240" w:lineRule="auto"/>
+    </w:pPr>
+    <w:rPr>
+      <w:rFonts w:ascii="Courier New" w:eastAsia="Times New Roman" w:hAnsi="Courier New" w:cs="Courier New"/>
+      <w:kern w:val="0"/>
+      <w:sz w:val="20"/>
+      <w:szCs w:val="20"/>
+      <w:lang w:eastAsia="en-GB"/>
+      <w14:ligatures w14:val="none"/>
+    </w:rPr>
+  </w:style>
+  <w:style w:type="character" w:customStyle="1" w:styleId="HTMLPreformattedChar">
+    <w:name w:val="HTML Preformatted Char"/>
+    <w:basedOn w:val="DefaultParagraphFont"/>
+    <w:link w:val="HTMLPreformatted"/>
+    <w:uiPriority w:val="99"/>
+    <w:semiHidden/>
+    <w:rsid w:val="008822BF"/>
+    <w:rPr>
+      <w:rFonts w:ascii="Courier New" w:eastAsia="Times New Roman" w:hAnsi="Courier New" w:cs="Courier New"/>
+      <w:kern w:val="0"/>
+      <w:sz w:val="20"/>
+      <w:szCs w:val="20"/>
+      <w:lang w:eastAsia="en-GB"/>
+      <w14:ligatures w14:val="none"/>
+    </w:rPr>
+  </w:style>
+  <w:style w:type="character" w:styleId="HTMLCode">
+    <w:name w:val="HTML Code"/>
+    <w:basedOn w:val="DefaultParagraphFont"/>
+    <w:uiPriority w:val="99"/>
+    <w:semiHidden/>
+    <w:unhideWhenUsed/>
+    <w:rsid w:val="008822BF"/>
+    <w:rPr>
+      <w:rFonts w:ascii="Courier New" w:eastAsia="Times New Roman" w:hAnsi="Courier New" w:cs="Courier New"/>
+      <w:sz w:val="20"/>
+      <w:szCs w:val="20"/>
+    </w:rPr>
+  </w:style>
 </w:styles>
 </file>
 

</xml_diff>

<commit_message>
Apply formatting on notes
</commit_message>
<xml_diff>
--- a/10_Applied_Data_Science_Project/2_Project_Notes_Materials/1_Data_Science_Capstone_Project_Notes.docx
+++ b/10_Applied_Data_Science_Project/2_Project_Notes_Materials/1_Data_Science_Capstone_Project_Notes.docx
@@ -22,6 +22,16 @@
           <w:szCs w:val="56"/>
         </w:rPr>
         <w:t>Table of Content</w:t>
+      </w:r>
+      <w:r>
+        <w:rPr>
+          <w:rFonts w:asciiTheme="majorBidi" w:hAnsiTheme="majorBidi" w:cstheme="majorBidi"/>
+          <w:b/>
+          <w:bCs/>
+          <w:sz w:val="56"/>
+          <w:szCs w:val="56"/>
+        </w:rPr>
+        <w:t>s</w:t>
       </w:r>
     </w:p>
     <w:p>

</xml_diff>